<commit_message>
Redesign Die_Reise_der_zwei_Neandertaler in Apple Design Studio editorial style
</commit_message>
<xml_diff>
--- a/Die_Reise_der_zwei_Neandertaler.docx
+++ b/Die_Reise_der_zwei_Neandertaler.docx
@@ -4,129 +4,156 @@
   <w:body>
     <w:p>
       <w:pPr>
-        <w:spacing w:before="400" w:after="160"/>
-        <w:jc w:val="center"/>
+        <w:keepNext/>
+        <w:spacing w:before="200" w:after="80"/>
       </w:pPr>
       <w:r>
         <w:rPr>
-          <w:rFonts w:ascii="Helvetica" w:hAnsi="Helvetica"/>
+          <w:rFonts w:ascii="Helvetica Neue" w:hAnsi="Helvetica Neue"/>
           <w:b/>
-          <w:color w:val="A85C28"/>
-          <w:sz w:val="19"/>
+          <w:color w:val="0F6E56"/>
+          <w:sz w:val="17"/>
         </w:rPr>
-        <w:t>REISE-SKIZZE · JUNI 2027</w:t>
+        <w:t>APPLE STUDIO EDITORIAL · REISEDOSSIER JUNI 2027</w:t>
       </w:r>
     </w:p>
     <w:p>
       <w:pPr>
-        <w:spacing w:after="200"/>
-        <w:jc w:val="center"/>
+        <w:keepNext/>
+        <w:spacing w:before="80" w:after="240"/>
       </w:pPr>
       <w:r>
         <w:rPr>
-          <w:rFonts w:ascii="Georgia" w:hAnsi="Georgia"/>
+          <w:rFonts w:ascii="Helvetica Neue" w:hAnsi="Helvetica Neue"/>
           <w:b/>
-          <w:color w:val="224C44"/>
-          <w:sz w:val="52"/>
+          <w:color w:val="1D1D1F"/>
+          <w:sz w:val="56"/>
         </w:rPr>
-        <w:t>Zwei Neandertaler auf großer Reise</w:t>
+        <w:t>Zwei Neandertaler.</w:t>
+      </w:r>
+      <w:r>
+        <w:rPr>
+          <w:rFonts w:ascii="Helvetica Neue" w:hAnsi="Helvetica Neue"/>
+          <w:b w:val="0"/>
+          <w:color w:val="6E6E73"/>
+          <w:sz w:val="56"/>
+        </w:rPr>
+        <w:t xml:space="preserve"> Auf großer Fahrt.</w:t>
       </w:r>
     </w:p>
     <w:p>
       <w:pPr>
-        <w:spacing w:after="560"/>
-        <w:jc w:val="center"/>
+        <w:spacing w:after="280" w:line="324" w:lineRule="auto"/>
       </w:pPr>
       <w:r>
         <w:rPr>
-          <w:rFonts w:ascii="Georgia" w:hAnsi="Georgia"/>
-          <w:i/>
-          <w:color w:val="6E6E73"/>
-          <w:sz w:val="26"/>
+          <w:rFonts w:ascii="Helvetica Neue" w:hAnsi="Helvetica Neue"/>
+          <w:color w:val="1D1D1F"/>
+          <w:sz w:val="25"/>
         </w:rPr>
-        <w:t>Eine kleine Juni-Geschichte über Seen, Schluchten, Zirbenduft und einen ganz beiläufigen Vormittag</w:t>
+        <w:t>Eine Erzählung über freie Autobahnen, alte Freunde am See, die Kühle alpiner Schluchten und einen vollkommen beiläufigen Samstagvormittag.</w:t>
       </w:r>
     </w:p>
     <w:p>
       <w:pPr>
-        <w:spacing w:line="300" w:lineRule="auto" w:after="140"/>
-        <w:jc w:val="both"/>
+        <w:spacing w:after="320"/>
       </w:pPr>
       <w:r>
         <w:rPr>
-          <w:rFonts w:ascii="Georgia" w:hAnsi="Georgia"/>
-          <w:color w:val="282828"/>
-          <w:sz w:val="22"/>
+          <w:color w:val="E5E5EA"/>
+          <w:sz w:val="12"/>
+        </w:rPr>
+        <w:t>_________________________________________________________________________________</w:t>
+      </w:r>
+    </w:p>
+    <w:p>
+      <w:pPr>
+        <w:keepNext/>
+        <w:spacing w:before="480" w:after="80"/>
+      </w:pPr>
+      <w:r>
+        <w:rPr>
+          <w:rFonts w:ascii="Helvetica Neue" w:hAnsi="Helvetica Neue"/>
+          <w:b/>
+          <w:color w:val="0F6E56"/>
+          <w:sz w:val="17"/>
+        </w:rPr>
+        <w:t>STATION 01 · BODENSEE</w:t>
+      </w:r>
+    </w:p>
+    <w:p>
+      <w:pPr>
+        <w:keepNext/>
+        <w:spacing w:before="80" w:after="240"/>
+      </w:pPr>
+      <w:r>
+        <w:rPr>
+          <w:rFonts w:ascii="Helvetica Neue" w:hAnsi="Helvetica Neue"/>
+          <w:b/>
+          <w:color w:val="1D1D1F"/>
+          <w:sz w:val="56"/>
+        </w:rPr>
+        <w:t>Das Wiedersehen</w:t>
+      </w:r>
+      <w:r>
+        <w:rPr>
+          <w:rFonts w:ascii="Helvetica Neue" w:hAnsi="Helvetica Neue"/>
+          <w:b w:val="0"/>
+          <w:color w:val="6E6E73"/>
+          <w:sz w:val="56"/>
+        </w:rPr>
+        <w:t xml:space="preserve"> am Wasser.</w:t>
+      </w:r>
+    </w:p>
+    <w:p>
+      <w:pPr>
+        <w:spacing w:after="180" w:line="324" w:lineRule="auto"/>
+      </w:pPr>
+      <w:r>
+        <w:rPr>
+          <w:rFonts w:ascii="Helvetica Neue" w:hAnsi="Helvetica Neue"/>
+          <w:color w:val="1D1D1F"/>
+          <w:sz w:val="21"/>
         </w:rPr>
         <w:t>Es war einmal Mitte Juni, als zwei kultivierte Neandertaler beschlossen, dass es im heimatlichen Tal an der Düssel zwar wunderschön war, die Welt hinter dem Horizont aber dringend erkundet werden musste.</w:t>
       </w:r>
     </w:p>
     <w:p>
       <w:pPr>
-        <w:spacing w:line="300" w:lineRule="auto" w:after="140"/>
-        <w:jc w:val="both"/>
+        <w:spacing w:after="180" w:line="324" w:lineRule="auto"/>
       </w:pPr>
       <w:r>
         <w:rPr>
-          <w:rFonts w:ascii="Georgia" w:hAnsi="Georgia"/>
-          <w:color w:val="282828"/>
-          <w:sz w:val="22"/>
+          <w:rFonts w:ascii="Helvetica Neue" w:hAnsi="Helvetica Neue"/>
+          <w:color w:val="1D1D1F"/>
+          <w:sz w:val="21"/>
         </w:rPr>
-        <w:t>Das Mammut war längst ausgestorben, die Keulen standen im Schrank, und anstelle eines mühsamen Fußmarsches durchs Gestrüpp besaßen die beiden eine äußerst komfortable, moderne Höhle auf vier Rädern: ihren Camper. Darin gab es ein weiches Bett, einen Herd für warmen Morgenkaffee und – ganz wichtig – absolute Unabhängigkeit.</w:t>
+        <w:t>Das Mammut war längst ausgestorben, die Keulen standen im Schrank, und anstelle eines mühsamen Fußmarsches durchs Gestrüpp besaßen die beiden eine äußerst komfortable, moderne Höhle auf vier Rädern: ihren Camper. Darin gab es ein breites Bett, eine Kaffeemaschine und absolute Unabhängigkeit.</w:t>
+      </w:r>
+    </w:p>
+    <w:p>
+      <w:pPr>
+        <w:spacing w:after="180" w:line="324" w:lineRule="auto"/>
+      </w:pPr>
+      <w:r>
+        <w:rPr>
+          <w:rFonts w:ascii="Helvetica Neue" w:hAnsi="Helvetica Neue"/>
+          <w:color w:val="1D1D1F"/>
+          <w:sz w:val="21"/>
+        </w:rPr>
+        <w:t>Die Reise begann ganz ohne Völkerwanderungs-Hektik: Noch kein Bundesland hatte Schulferien, die Straßen waren leer. Am Nachmittag erreichten sie den Bodensee in Lindau. Camper abstellen, Freunde umarmen, den Sonnenuntergang über dem spiegelglatten Wasser beobachten, Bodenseefisch essen und alte Geschichten bei gutem Wein austauschen. Als die beiden am nächsten Morgen bei Seeblick frühstückten, war der Urlaub längst da.</w:t>
       </w:r>
     </w:p>
     <w:p>
       <w:pPr>
         <w:keepNext/>
-        <w:spacing w:before="440" w:after="160"/>
-      </w:pPr>
-      <w:r>
-        <w:rPr>
-          <w:rFonts w:ascii="Helvetica" w:hAnsi="Helvetica"/>
-          <w:b/>
-          <w:color w:val="224C44"/>
-          <w:sz w:val="30"/>
-        </w:rPr>
-        <w:t>1. Erste Rast: Die Sippe am großen Wasser</w:t>
-      </w:r>
-    </w:p>
-    <w:p>
-      <w:pPr>
-        <w:spacing w:line="300" w:lineRule="auto" w:after="140"/>
-        <w:jc w:val="both"/>
-      </w:pPr>
-      <w:r>
-        <w:rPr>
-          <w:rFonts w:ascii="Georgia" w:hAnsi="Georgia"/>
-          <w:color w:val="282828"/>
-          <w:sz w:val="22"/>
-        </w:rPr>
-        <w:t>Ihre Reise begann mit einer Fahrt nach Süden, noch bevor die großen Völkerwanderungen der Schulferien die Pfade verstopften. Die Sonne schien mild, die Luft war klar, und nach ein paar Stunden gemütlichen Rollens erreichten sie das große Wasser: den Bodensee.</w:t>
-      </w:r>
-    </w:p>
-    <w:p>
-      <w:pPr>
-        <w:spacing w:line="300" w:lineRule="auto" w:after="140"/>
-        <w:jc w:val="both"/>
-      </w:pPr>
-      <w:r>
-        <w:rPr>
-          <w:rFonts w:ascii="Georgia" w:hAnsi="Georgia"/>
-          <w:color w:val="282828"/>
-          <w:sz w:val="22"/>
-        </w:rPr>
-        <w:t>In Lindau machten sie Halt, um befreundete Stammesmitglieder zu besuchen. Am Ufer wurde der Camper abgestellt, es gab ein großes Wiedersehen, gebratenen Fisch, feinen vergorenen Traubensaft und Geschichten bis spät in die milde Nacht. Als die beiden am nächsten Morgen mit Blick über das glitzernde Wasser frühstückten, waren sie sich einig: Der Auszug aus dem Neandertal war jetzt schon ein voller Erfolg.</w:t>
-      </w:r>
-    </w:p>
-    <w:p>
-      <w:pPr>
-        <w:spacing w:before="240" w:after="80"/>
+        <w:spacing w:before="280" w:after="100"/>
         <w:jc w:val="center"/>
       </w:pPr>
       <w:r>
         <w:drawing>
           <wp:inline xmlns:a="http://schemas.openxmlformats.org/drawingml/2006/main" xmlns:pic="http://schemas.openxmlformats.org/drawingml/2006/picture">
-            <wp:extent cx="5303520" cy="1763420"/>
+            <wp:extent cx="5824728" cy="1936722"/>
             <wp:docPr id="1" name="Picture 1"/>
             <wp:cNvGraphicFramePr>
               <a:graphicFrameLocks noChangeAspect="1"/>
@@ -147,7 +174,7 @@
                   <pic:spPr>
                     <a:xfrm>
                       <a:off x="0" y="0"/>
-                      <a:ext cx="5303520" cy="1763420"/>
+                      <a:ext cx="5824728" cy="1936722"/>
                     </a:xfrm>
                     <a:prstGeom prst="rect"/>
                   </pic:spPr>
@@ -160,85 +187,101 @@
     </w:p>
     <w:p>
       <w:pPr>
-        <w:spacing w:after="280"/>
-        <w:jc w:val="center"/>
+        <w:spacing w:after="360" w:line="276" w:lineRule="auto"/>
       </w:pPr>
       <w:r>
         <w:rPr>
-          <w:rFonts w:ascii="Helvetica" w:hAnsi="Helvetica"/>
-          <w:i/>
+          <w:rFonts w:ascii="Helvetica Neue" w:hAnsi="Helvetica Neue"/>
+          <w:b/>
+          <w:color w:val="1D1D1F"/>
+          <w:sz w:val="17"/>
+        </w:rPr>
+        <w:t xml:space="preserve">Lindau am Bodensee.  </w:t>
+      </w:r>
+      <w:r>
+        <w:rPr>
+          <w:rFonts w:ascii="Helvetica Neue" w:hAnsi="Helvetica Neue"/>
           <w:color w:val="6E6E73"/>
-          <w:sz w:val="18"/>
+          <w:sz w:val="17"/>
         </w:rPr>
-        <w:t>Erste Station: Abendsonne am Bodensee und Wiedersehen mit Freunden in Lindau.</w:t>
+        <w:t>Hafenpromenade und Mangturm im warmen Abendlicht.</w:t>
       </w:r>
     </w:p>
     <w:p>
       <w:pPr>
         <w:keepNext/>
-        <w:spacing w:before="440" w:after="160"/>
+        <w:spacing w:before="480" w:after="80"/>
       </w:pPr>
       <w:r>
         <w:rPr>
-          <w:rFonts w:ascii="Helvetica" w:hAnsi="Helvetica"/>
+          <w:rFonts w:ascii="Helvetica Neue" w:hAnsi="Helvetica Neue"/>
           <w:b/>
-          <w:color w:val="224C44"/>
-          <w:sz w:val="30"/>
+          <w:color w:val="0F6E56"/>
+          <w:sz w:val="17"/>
         </w:rPr>
-        <w:t>2. Das neue Revier im Felsengebirge</w:t>
+        <w:t>STATION 02 · TIROLER INNTAL</w:t>
       </w:r>
     </w:p>
     <w:p>
       <w:pPr>
-        <w:spacing w:line="300" w:lineRule="auto" w:after="140"/>
-        <w:jc w:val="both"/>
+        <w:keepNext/>
+        <w:spacing w:before="80" w:after="240"/>
       </w:pPr>
       <w:r>
         <w:rPr>
-          <w:rFonts w:ascii="Georgia" w:hAnsi="Georgia"/>
-          <w:color w:val="282828"/>
-          <w:sz w:val="22"/>
+          <w:rFonts w:ascii="Helvetica Neue" w:hAnsi="Helvetica Neue"/>
+          <w:b/>
+          <w:color w:val="1D1D1F"/>
+          <w:sz w:val="56"/>
         </w:rPr>
-        <w:t>Von Lindau aus war es nur ein kleiner Sprung von anderthalb Stunden über die Berge bis ins Tiroler Oberland. Ihr Ziel hieß Imst – ein Ort, der von so gewaltigen, gezackten Kalksteinwänden umrahmt war, dass jedem traditionsbewussten Neandertaler das Herz aufging.</w:t>
+        <w:t>Das Basislager</w:t>
+      </w:r>
+      <w:r>
+        <w:rPr>
+          <w:rFonts w:ascii="Helvetica Neue" w:hAnsi="Helvetica Neue"/>
+          <w:b w:val="0"/>
+          <w:color w:val="6E6E73"/>
+          <w:sz w:val="56"/>
+        </w:rPr>
+        <w:t xml:space="preserve"> unter den Wänden.</w:t>
       </w:r>
     </w:p>
     <w:p>
       <w:pPr>
-        <w:spacing w:line="300" w:lineRule="auto" w:after="140"/>
-        <w:jc w:val="both"/>
+        <w:spacing w:after="180" w:line="324" w:lineRule="auto"/>
       </w:pPr>
       <w:r>
         <w:rPr>
-          <w:rFonts w:ascii="Georgia" w:hAnsi="Georgia"/>
-          <w:color w:val="282828"/>
-          <w:sz w:val="22"/>
+          <w:rFonts w:ascii="Helvetica Neue" w:hAnsi="Helvetica Neue"/>
+          <w:color w:val="1D1D1F"/>
+          <w:sz w:val="21"/>
         </w:rPr>
-        <w:t>Sie bezogen ihr Basislager auf einem kleinen, feinen Platz namens Campingpark FiNK. Hier gab es keinen Höhlenlärm und keine wilden Horden, sondern beheizte Waschräume von erstaunlichem Luxus, absolute Nachtruhe und einen Dorfbecker, der morgens nur drei Minuten Fußweg entfernt frisches Brot buk. Von den Campingstühlen aus blickte man direkt hinauf in die schroffen Felsen des Muttekopfs.</w:t>
+        <w:t>Von Lindau aus waren es gerade einmal knapp anderthalb entspannte Fahrstunden hinauf ins Tiroler Oberland nach Imst. Umrahmt von gewaltigen, gezackten Kalksteinabstürzen bezogen sie Quartier auf dem Campingpark FiNK: ein kleiner, tadellos gepflegter Platz abseits großer Touristenburgen, mit beheizten Traumbädern, absoluter Stille und frischen Bäckerbrötchen in drei Gehminuten.</w:t>
       </w:r>
     </w:p>
     <w:p>
       <w:pPr>
-        <w:spacing w:line="300" w:lineRule="auto" w:after="140"/>
-        <w:jc w:val="both"/>
+        <w:spacing w:after="180" w:line="324" w:lineRule="auto"/>
       </w:pPr>
       <w:r>
         <w:rPr>
-          <w:rFonts w:ascii="Georgia" w:hAnsi="Georgia"/>
-          <w:color w:val="282828"/>
-          <w:sz w:val="22"/>
+          <w:rFonts w:ascii="Helvetica Neue" w:hAnsi="Helvetica Neue"/>
+          <w:color w:val="1D1D1F"/>
+          <w:sz w:val="21"/>
         </w:rPr>
-        <w:t>Und das Beste: Es hatte frische 20 Grad. Keine sengende Hitze, bei der einem das Fell zu warm wurde, sondern perfektes Wanderwetter.</w:t>
+        <w:t>Der größte Luxus im Juni: die Temperatur. Während unten im Tal angenehme 20 bis 22 Grad herrschten, kühlte es nachts zuverlässig auf frische 10 Grad ab. Keine Hitzeglocke, kein Schwitzen – stattdessen glasklare Bergluft ab dem ersten Atemzug am Morgen.</w:t>
       </w:r>
     </w:p>
     <w:p>
       <w:pPr>
-        <w:spacing w:before="240" w:after="80"/>
+        <w:keepNext/>
+        <w:spacing w:before="280" w:after="100"/>
         <w:jc w:val="center"/>
       </w:pPr>
       <w:r>
         <w:drawing>
           <wp:inline xmlns:a="http://schemas.openxmlformats.org/drawingml/2006/main" xmlns:pic="http://schemas.openxmlformats.org/drawingml/2006/picture">
-            <wp:extent cx="5303520" cy="7001347"/>
+            <wp:extent cx="5824728" cy="7689410"/>
             <wp:docPr id="2" name="Picture 2"/>
             <wp:cNvGraphicFramePr>
               <a:graphicFrameLocks noChangeAspect="1"/>
@@ -259,7 +302,7 @@
                   <pic:spPr>
                     <a:xfrm>
                       <a:off x="0" y="0"/>
-                      <a:ext cx="5303520" cy="7001347"/>
+                      <a:ext cx="5824728" cy="7689410"/>
                     </a:xfrm>
                     <a:prstGeom prst="rect"/>
                   </pic:spPr>
@@ -272,127 +315,184 @@
     </w:p>
     <w:p>
       <w:pPr>
-        <w:spacing w:after="280"/>
-        <w:jc w:val="center"/>
+        <w:spacing w:after="360" w:line="276" w:lineRule="auto"/>
       </w:pPr>
       <w:r>
         <w:rPr>
-          <w:rFonts w:ascii="Helvetica" w:hAnsi="Helvetica"/>
-          <w:i/>
+          <w:rFonts w:ascii="Helvetica Neue" w:hAnsi="Helvetica Neue"/>
+          <w:b/>
+          <w:color w:val="1D1D1F"/>
+          <w:sz w:val="17"/>
+        </w:rPr>
+        <w:t xml:space="preserve">Felskulisse über Imst.  </w:t>
+      </w:r>
+      <w:r>
+        <w:rPr>
+          <w:rFonts w:ascii="Helvetica Neue" w:hAnsi="Helvetica Neue"/>
           <w:color w:val="6E6E73"/>
-          <w:sz w:val="18"/>
+          <w:sz w:val="17"/>
         </w:rPr>
-        <w:t>Der Hausberg vor der Campertür: Das Felsmassiv des Imster Muttekopfs.</w:t>
+        <w:t>Der Muttekopf (2.774 m) ragt direkt über dem Talboden auf.</w:t>
       </w:r>
     </w:p>
     <w:p>
       <w:pPr>
         <w:keepNext/>
-        <w:spacing w:before="440" w:after="160"/>
+        <w:spacing w:before="480" w:after="80"/>
       </w:pPr>
       <w:r>
         <w:rPr>
-          <w:rFonts w:ascii="Helvetica" w:hAnsi="Helvetica"/>
+          <w:rFonts w:ascii="Helvetica Neue" w:hAnsi="Helvetica Neue"/>
           <w:b/>
-          <w:color w:val="224C44"/>
-          <w:sz w:val="30"/>
+          <w:color w:val="0F6E56"/>
+          <w:sz w:val="17"/>
         </w:rPr>
-        <w:t>3. Zehn Tage Durchstreifen der Wälder &amp; Almen</w:t>
+        <w:t>STATION 03 · WANDERWEGE &amp; KULTUR</w:t>
       </w:r>
     </w:p>
     <w:p>
       <w:pPr>
-        <w:spacing w:line="300" w:lineRule="auto" w:after="140"/>
-        <w:jc w:val="both"/>
+        <w:keepNext/>
+        <w:spacing w:before="80" w:after="240"/>
       </w:pPr>
       <w:r>
         <w:rPr>
-          <w:rFonts w:ascii="Georgia" w:hAnsi="Georgia"/>
-          <w:color w:val="282828"/>
-          <w:sz w:val="22"/>
+          <w:rFonts w:ascii="Helvetica Neue" w:hAnsi="Helvetica Neue"/>
+          <w:b/>
+          <w:color w:val="1D1D1F"/>
+          <w:sz w:val="56"/>
         </w:rPr>
-        <w:t>In den folgenden Tagen machten die beiden genau das, was Neandertaler am besten können: gemächlich, aber ausdauernd durch die Landschaft streifen. Allerdings ohne Jagdstress, sondern als reiner Genuss.</w:t>
+        <w:t>Schluchten, Zirbenduft</w:t>
+      </w:r>
+      <w:r>
+        <w:rPr>
+          <w:rFonts w:ascii="Helvetica Neue" w:hAnsi="Helvetica Neue"/>
+          <w:b w:val="0"/>
+          <w:color w:val="6E6E73"/>
+          <w:sz w:val="56"/>
+        </w:rPr>
+        <w:t xml:space="preserve"> &amp; alte Meister.</w:t>
       </w:r>
     </w:p>
     <w:p>
       <w:pPr>
-        <w:spacing w:line="300" w:lineRule="auto" w:after="140"/>
-        <w:jc w:val="both"/>
+        <w:spacing w:after="180" w:line="324" w:lineRule="auto"/>
       </w:pPr>
       <w:r>
         <w:rPr>
-          <w:rFonts w:ascii="Georgia" w:hAnsi="Georgia"/>
-          <w:color w:val="282828"/>
-          <w:sz w:val="22"/>
+          <w:rFonts w:ascii="Helvetica Neue" w:hAnsi="Helvetica Neue"/>
+          <w:color w:val="1D1D1F"/>
+          <w:sz w:val="21"/>
         </w:rPr>
-        <w:t>Sie wanderten vier bis fünf Stunden am Tag, sammelten 500 bis 700 Höhenmeter und folgten schmalen, sicheren Pfaden:</w:t>
+        <w:t>In den folgenden zehn Tagen taten die beiden genau das, was Neandertaler am besten können: genüsslich durch ihr Revier streifen. Keine alpinen Gewaltmärsche, sondern das bewährte Wohlfühlfenster von vier bis fünf Stunden und 500 bis 700 Höhenmetern auf besten, trittsicheren Wegen:</w:t>
       </w:r>
     </w:p>
     <w:p>
       <w:pPr>
-        <w:spacing w:line="300" w:lineRule="auto" w:after="140"/>
-        <w:jc w:val="both"/>
+        <w:spacing w:after="120" w:line="312" w:lineRule="auto"/>
+        <w:ind w:left="360"/>
       </w:pPr>
       <w:r>
         <w:rPr>
-          <w:rFonts w:ascii="Georgia" w:hAnsi="Georgia"/>
-          <w:color w:val="282828"/>
-          <w:sz w:val="22"/>
+          <w:rFonts w:ascii="Helvetica Neue" w:hAnsi="Helvetica Neue"/>
+          <w:b/>
+          <w:color w:val="0F6E56"/>
+          <w:sz w:val="20"/>
         </w:rPr>
-        <w:t>• Durch die kühle, tosende Rosengartenschlucht, wo das Gebirgswasser über Felsstufen donnerte und die Luft nach feuchtem Moos und Stein roch.</w:t>
+        <w:t xml:space="preserve">—  </w:t>
+      </w:r>
+      <w:r>
+        <w:rPr>
+          <w:rFonts w:ascii="Helvetica Neue" w:hAnsi="Helvetica Neue"/>
+          <w:b/>
+          <w:color w:val="1D1D1F"/>
+          <w:sz w:val="21"/>
+        </w:rPr>
+        <w:t xml:space="preserve">Rosengartenschlucht: </w:t>
+      </w:r>
+      <w:r>
+        <w:rPr>
+          <w:rFonts w:ascii="Helvetica Neue" w:hAnsi="Helvetica Neue"/>
+          <w:color w:val="1D1D1F"/>
+          <w:sz w:val="21"/>
+        </w:rPr>
+        <w:t>Start direkt am Platz. Auf Holzstegen durch die schäumende Klamm hinauf zur Blauen Grotte und zur sonnigen Terrasse der Muttekopfhütte.</w:t>
       </w:r>
     </w:p>
     <w:p>
       <w:pPr>
-        <w:spacing w:line="300" w:lineRule="auto" w:after="140"/>
-        <w:jc w:val="both"/>
+        <w:spacing w:after="120" w:line="312" w:lineRule="auto"/>
+        <w:ind w:left="360"/>
       </w:pPr>
       <w:r>
         <w:rPr>
-          <w:rFonts w:ascii="Georgia" w:hAnsi="Georgia"/>
-          <w:color w:val="282828"/>
-          <w:sz w:val="22"/>
+          <w:rFonts w:ascii="Helvetica Neue" w:hAnsi="Helvetica Neue"/>
+          <w:b/>
+          <w:color w:val="0F6E56"/>
+          <w:sz w:val="20"/>
         </w:rPr>
-        <w:t>• Hinauf zur Muttekopfhütte, wo die gastfreundlichen Bergbewohner auf einer sonnigen Holzterrasse riesige Pfannen mit dampfendem Kaiserschmarrn servierten.</w:t>
+        <w:t xml:space="preserve">—  </w:t>
+      </w:r>
+      <w:r>
+        <w:rPr>
+          <w:rFonts w:ascii="Helvetica Neue" w:hAnsi="Helvetica Neue"/>
+          <w:b/>
+          <w:color w:val="1D1D1F"/>
+          <w:sz w:val="21"/>
+        </w:rPr>
+        <w:t xml:space="preserve">Piburger See: </w:t>
+      </w:r>
+      <w:r>
+        <w:rPr>
+          <w:rFonts w:ascii="Helvetica Neue" w:hAnsi="Helvetica Neue"/>
+          <w:color w:val="1D1D1F"/>
+          <w:sz w:val="21"/>
+        </w:rPr>
+        <w:t>Ein tiefblauer, herrlich temperierter Waldsee im vorderen Ötztal. Schattiger Rundweg mit Badesteg und Forellenessen am Wasser.</w:t>
       </w:r>
     </w:p>
     <w:p>
       <w:pPr>
-        <w:spacing w:line="300" w:lineRule="auto" w:after="140"/>
-        <w:jc w:val="both"/>
+        <w:spacing w:after="120" w:line="312" w:lineRule="auto"/>
+        <w:ind w:left="360"/>
       </w:pPr>
       <w:r>
         <w:rPr>
-          <w:rFonts w:ascii="Georgia" w:hAnsi="Georgia"/>
-          <w:color w:val="282828"/>
-          <w:sz w:val="22"/>
+          <w:rFonts w:ascii="Helvetica Neue" w:hAnsi="Helvetica Neue"/>
+          <w:b/>
+          <w:color w:val="0F6E56"/>
+          <w:sz w:val="20"/>
         </w:rPr>
-        <w:t>• Zum Piburger See, der wie ein dunkelgrüner Smaragd tief im Nadelwald versteckt lag. Dort zogen sie die Wanderstiefel aus und ließen die Füße ins klare Wasser baumeln.</w:t>
+        <w:t xml:space="preserve">—  </w:t>
+      </w:r>
+      <w:r>
+        <w:rPr>
+          <w:rFonts w:ascii="Helvetica Neue" w:hAnsi="Helvetica Neue"/>
+          <w:b/>
+          <w:color w:val="1D1D1F"/>
+          <w:sz w:val="21"/>
+        </w:rPr>
+        <w:t xml:space="preserve">Zirbenweg am Hochzeiger: </w:t>
+      </w:r>
+      <w:r>
+        <w:rPr>
+          <w:rFonts w:ascii="Helvetica Neue" w:hAnsi="Helvetica Neue"/>
+          <w:color w:val="1D1D1F"/>
+          <w:sz w:val="21"/>
+        </w:rPr>
+        <w:t>Auf 2.000 Meter Höhe fast eben durch Jahrhunderte alte, intensiv duftende Zirbenbestände mit Blick auf die Gletscher.</w:t>
       </w:r>
     </w:p>
     <w:p>
       <w:pPr>
-        <w:spacing w:line="300" w:lineRule="auto" w:after="140"/>
-        <w:jc w:val="both"/>
-      </w:pPr>
-      <w:r>
-        <w:rPr>
-          <w:rFonts w:ascii="Georgia" w:hAnsi="Georgia"/>
-          <w:color w:val="282828"/>
-          <w:sz w:val="22"/>
-        </w:rPr>
-        <w:t>• Und hoch hinauf auf 2.000 Meter, wo sie stundenlang auf weichem Nadelboden durch uralte, intensiv duftende Zirbenwälder schlenderten.</w:t>
-      </w:r>
-    </w:p>
-    <w:p>
-      <w:pPr>
-        <w:spacing w:before="240" w:after="80"/>
+        <w:keepNext/>
+        <w:spacing w:before="280" w:after="100"/>
         <w:jc w:val="center"/>
       </w:pPr>
       <w:r>
         <w:drawing>
           <wp:inline xmlns:a="http://schemas.openxmlformats.org/drawingml/2006/main" xmlns:pic="http://schemas.openxmlformats.org/drawingml/2006/picture">
-            <wp:extent cx="5303520" cy="7955280"/>
+            <wp:extent cx="5824728" cy="8737092"/>
             <wp:docPr id="3" name="Picture 3"/>
             <wp:cNvGraphicFramePr>
               <a:graphicFrameLocks noChangeAspect="1"/>
@@ -413,7 +513,7 @@
                   <pic:spPr>
                     <a:xfrm>
                       <a:off x="0" y="0"/>
-                      <a:ext cx="5303520" cy="7955280"/>
+                      <a:ext cx="5824728" cy="8737092"/>
                     </a:xfrm>
                     <a:prstGeom prst="rect"/>
                   </pic:spPr>
@@ -426,84 +526,49 @@
     </w:p>
     <w:p>
       <w:pPr>
-        <w:spacing w:after="280"/>
-        <w:jc w:val="center"/>
+        <w:spacing w:after="360" w:line="276" w:lineRule="auto"/>
       </w:pPr>
       <w:r>
         <w:rPr>
-          <w:rFonts w:ascii="Helvetica" w:hAnsi="Helvetica"/>
-          <w:i/>
+          <w:rFonts w:ascii="Helvetica Neue" w:hAnsi="Helvetica Neue"/>
+          <w:b/>
+          <w:color w:val="1D1D1F"/>
+          <w:sz w:val="17"/>
+        </w:rPr>
+        <w:t xml:space="preserve">Rosengartenschlucht.  </w:t>
+      </w:r>
+      <w:r>
+        <w:rPr>
+          <w:rFonts w:ascii="Helvetica Neue" w:hAnsi="Helvetica Neue"/>
           <w:color w:val="6E6E73"/>
-          <w:sz w:val="18"/>
+          <w:sz w:val="17"/>
         </w:rPr>
-        <w:t>Kühle Gischt und Holzstege: Aufstieg durch die wilde Rosengartenschlucht.</w:t>
+        <w:t>Naturdenkmal mit Stegen direkt ab Ortsrand Imst.</w:t>
       </w:r>
     </w:p>
     <w:p>
       <w:pPr>
-        <w:spacing w:line="300" w:lineRule="auto" w:after="140"/>
-        <w:jc w:val="both"/>
+        <w:spacing w:after="180" w:line="324" w:lineRule="auto"/>
       </w:pPr>
       <w:r>
         <w:rPr>
-          <w:rFonts w:ascii="Georgia" w:hAnsi="Georgia"/>
-          <w:color w:val="282828"/>
-          <w:sz w:val="22"/>
+          <w:rFonts w:ascii="Helvetica Neue" w:hAnsi="Helvetica Neue"/>
+          <w:color w:val="1D1D1F"/>
+          <w:sz w:val="21"/>
         </w:rPr>
-        <w:t>Weil die beiden Neandertaler von Natur aus ein Faible für alte Dinge und schöne Formen hatten, schauten sie sich auch die Nachbarn genauer an:</w:t>
+        <w:t>Weil beide einen wachen Geist für Schönes und Geschichtsträchtiges hatten, flochten sie Entdeckungen in ihre Tage ein: Sie besuchten im Ötztal das Dorf von Ötzi – jenem jungen Schnösel aus der Kupferzeit, der mit seiner modernen Metall-Axt zwar berühmt wurde, aber gegen echte Neandertaler-Zähigkeit verblasste. Sie standen am 3.500 Jahre alten Brandopferplatz am Piller Sattel an der Römerstraße Via Claudia Augusta. Und an einem Nachmittag fuhren sie nach Innsbruck, um die futuristischen Glas-Stationen von Zaha Hadid zu bestaunen und in den Gassen Espresso zu trinken.</w:t>
       </w:r>
     </w:p>
     <w:p>
       <w:pPr>
-        <w:spacing w:line="300" w:lineRule="auto" w:after="140"/>
-        <w:jc w:val="both"/>
-      </w:pPr>
-      <w:r>
-        <w:rPr>
-          <w:rFonts w:ascii="Georgia" w:hAnsi="Georgia"/>
-          <w:color w:val="282828"/>
-          <w:sz w:val="22"/>
-        </w:rPr>
-        <w:t>• Sie besuchten am Eingang des Ötztals die Siedlung dieses Ötzi – ein junger Schnösel aus der Kupferzeit, der mit seiner neumodischen Metall-Axt zwar berühmt geworden war, aber gegen echte Neandertaler-Zähigkeit natürlich keine Chance gehabt hätte.</w:t>
-      </w:r>
-    </w:p>
-    <w:p>
-      <w:pPr>
-        <w:spacing w:line="300" w:lineRule="auto" w:after="140"/>
-        <w:jc w:val="both"/>
-      </w:pPr>
-      <w:r>
-        <w:rPr>
-          <w:rFonts w:ascii="Georgia" w:hAnsi="Georgia"/>
-          <w:color w:val="282828"/>
-          <w:sz w:val="22"/>
-        </w:rPr>
-        <w:t>• Sie stiegen zum Piller Sattel auf, wo vor 3.500 Jahren die Menschen auf einem Altar den Göttern Waffen und Schmuck opferten.</w:t>
-      </w:r>
-    </w:p>
-    <w:p>
-      <w:pPr>
-        <w:spacing w:line="300" w:lineRule="auto" w:after="140"/>
-        <w:jc w:val="both"/>
-      </w:pPr>
-      <w:r>
-        <w:rPr>
-          <w:rFonts w:ascii="Georgia" w:hAnsi="Georgia"/>
-          <w:color w:val="282828"/>
-          <w:sz w:val="22"/>
-        </w:rPr>
-        <w:t>• Und sie machten einen Ausflug nach Innsbruck, um die kühnen, geschwungenen Glas-Höhlen der legendären Baumeisterin Zaha Hadid zu bestaunen und in der Stadt einen Espresso zu trinken.</w:t>
-      </w:r>
-    </w:p>
-    <w:p>
-      <w:pPr>
-        <w:spacing w:before="240" w:after="80"/>
+        <w:keepNext/>
+        <w:spacing w:before="280" w:after="100"/>
         <w:jc w:val="center"/>
       </w:pPr>
       <w:r>
         <w:drawing>
           <wp:inline xmlns:a="http://schemas.openxmlformats.org/drawingml/2006/main" xmlns:pic="http://schemas.openxmlformats.org/drawingml/2006/picture">
-            <wp:extent cx="5303520" cy="3977640"/>
+            <wp:extent cx="5824728" cy="4368546"/>
             <wp:docPr id="4" name="Picture 4"/>
             <wp:cNvGraphicFramePr>
               <a:graphicFrameLocks noChangeAspect="1"/>
@@ -524,7 +589,7 @@
                   <pic:spPr>
                     <a:xfrm>
                       <a:off x="0" y="0"/>
-                      <a:ext cx="5303520" cy="3977640"/>
+                      <a:ext cx="5824728" cy="4368546"/>
                     </a:xfrm>
                     <a:prstGeom prst="rect"/>
                   </pic:spPr>
@@ -537,156 +602,255 @@
     </w:p>
     <w:p>
       <w:pPr>
-        <w:spacing w:after="280"/>
-        <w:jc w:val="center"/>
+        <w:spacing w:after="360" w:line="276" w:lineRule="auto"/>
       </w:pPr>
       <w:r>
         <w:rPr>
-          <w:rFonts w:ascii="Helvetica" w:hAnsi="Helvetica"/>
-          <w:i/>
+          <w:rFonts w:ascii="Helvetica Neue" w:hAnsi="Helvetica Neue"/>
+          <w:b/>
+          <w:color w:val="1D1D1F"/>
+          <w:sz w:val="17"/>
+        </w:rPr>
+        <w:t xml:space="preserve">Piburger See.  </w:t>
+      </w:r>
+      <w:r>
+        <w:rPr>
+          <w:rFonts w:ascii="Helvetica Neue" w:hAnsi="Helvetica Neue"/>
           <w:color w:val="6E6E73"/>
-          <w:sz w:val="18"/>
+          <w:sz w:val="17"/>
         </w:rPr>
-        <w:t>Verstecktes Naturjuwel im Nadelwald: Der warme Piburger See am Ötztal-Eingang.</w:t>
+        <w:t>Kristallklares Waldwasser vor der Kulisse des Acherkogels.</w:t>
       </w:r>
     </w:p>
     <w:p>
       <w:pPr>
         <w:keepNext/>
-        <w:spacing w:before="440" w:after="160"/>
+        <w:spacing w:before="480" w:after="80"/>
       </w:pPr>
       <w:r>
         <w:rPr>
-          <w:rFonts w:ascii="Helvetica" w:hAnsi="Helvetica"/>
+          <w:rFonts w:ascii="Helvetica Neue" w:hAnsi="Helvetica Neue"/>
           <w:b/>
-          <w:color w:val="224C44"/>
-          <w:sz w:val="30"/>
+          <w:color w:val="0F6E56"/>
+          <w:sz w:val="17"/>
         </w:rPr>
-        <w:t>4. Der eine, ganz beiläufige Samstagmorgen</w:t>
+        <w:t>STATION 04 · DER SAMSTAGMORGEN</w:t>
       </w:r>
     </w:p>
     <w:p>
       <w:pPr>
-        <w:spacing w:line="300" w:lineRule="auto" w:after="140"/>
-        <w:jc w:val="both"/>
+        <w:keepNext/>
+        <w:spacing w:before="80" w:after="240"/>
       </w:pPr>
       <w:r>
         <w:rPr>
-          <w:rFonts w:ascii="Georgia" w:hAnsi="Georgia"/>
-          <w:color w:val="282828"/>
-          <w:sz w:val="22"/>
+          <w:rFonts w:ascii="Helvetica Neue" w:hAnsi="Helvetica Neue"/>
+          <w:b/>
+          <w:color w:val="1D1D1F"/>
+          <w:sz w:val="56"/>
+        </w:rPr>
+        <w:t>Die feine Kunst</w:t>
+      </w:r>
+      <w:r>
+        <w:rPr>
+          <w:rFonts w:ascii="Helvetica Neue" w:hAnsi="Helvetica Neue"/>
+          <w:b w:val="0"/>
+          <w:color w:val="6E6E73"/>
+          <w:sz w:val="56"/>
+        </w:rPr>
+        <w:t xml:space="preserve"> der Ruhe.</w:t>
+      </w:r>
+    </w:p>
+    <w:p>
+      <w:pPr>
+        <w:spacing w:after="180" w:line="324" w:lineRule="auto"/>
+      </w:pPr>
+      <w:r>
+        <w:rPr>
+          <w:rFonts w:ascii="Helvetica Neue" w:hAnsi="Helvetica Neue"/>
+          <w:color w:val="1D1D1F"/>
+          <w:sz w:val="21"/>
         </w:rPr>
         <w:t>Am ersten Samstagmorgen trat eine uralte, friedliche Arbeitsteilung in Kraft:</w:t>
       </w:r>
     </w:p>
     <w:p>
       <w:pPr>
-        <w:spacing w:line="300" w:lineRule="auto" w:after="140"/>
-        <w:jc w:val="both"/>
+        <w:spacing w:after="180" w:line="324" w:lineRule="auto"/>
       </w:pPr>
       <w:r>
         <w:rPr>
-          <w:rFonts w:ascii="Georgia" w:hAnsi="Georgia"/>
-          <w:color w:val="282828"/>
-          <w:sz w:val="22"/>
+          <w:rFonts w:ascii="Helvetica Neue" w:hAnsi="Helvetica Neue"/>
+          <w:color w:val="1D1D1F"/>
+          <w:sz w:val="21"/>
         </w:rPr>
-        <w:t>Die Neandertalerin entschied sich für die Königsdisziplin der Erholung: Sie schlief genüsslich aus, kochte sich in aller Seelenruhe einen heißen Kaffee, stellte den Liegestuhl in die Morgensonne vor den Camper und vertiefte sich in ihr Buch.</w:t>
+        <w:t>Sie entschied sich für die absolute Königsdisziplin der Ferien: genüsslich ausschlafen, den ersten Espresso aufbrühen, den Liegestuhl in die Morgensonne vor den Camper stellen und mit einem guten Buch die Seele baumeln lassen.</w:t>
       </w:r>
     </w:p>
     <w:p>
       <w:pPr>
-        <w:spacing w:line="300" w:lineRule="auto" w:after="140"/>
-        <w:jc w:val="both"/>
+        <w:spacing w:after="180" w:line="324" w:lineRule="auto"/>
       </w:pPr>
       <w:r>
         <w:rPr>
-          <w:rFonts w:ascii="Georgia" w:hAnsi="Georgia"/>
-          <w:color w:val="282828"/>
-          <w:sz w:val="22"/>
+          <w:rFonts w:ascii="Helvetica Neue" w:hAnsi="Helvetica Neue"/>
+          <w:color w:val="1D1D1F"/>
+          <w:sz w:val="21"/>
         </w:rPr>
-        <w:t>Der Neandertaler hingegen verspürte ein kurzes, harmloses Jucken in den Beinen. Ganz beiläufig trabte er um die Ecke in den Fichtenwald. Dort veranstaltete der örtliche Dorfverein einen kleinen, feinen Waldlauf über 16 Kilometer. Für schmale 35 Tauschmünzen lief er anderthalb Stunden mit den Einheimischen über weiche Wurzelpfade durch die Tannen, schwitzte sich einmal gründlich aus – und stand pünktlich um 11:30 Uhr frisch geduscht, wohlriechend und bester Laune wieder am Camper.</w:t>
+        <w:t>Er hingegen verspürte das typische leichte Kribbeln in den Beinen. Völlig unaufgeregt trabte er um die Ecke in den Fichtenwald: Dort veranstaltete der lokale Turn- und Sportverein einen kleinen, ehrlichen Waldlauf über 16 Kilometer. Für schmale 35 Tauschmünzen lief er knapp anderthalb Stunden über weiche Wald- und Almwege, schwitzte sich einmal gründlich durch – und stand um 11:30 Uhr frisch geduscht, duftend und mit frischen Früchten wieder am Camper.</w:t>
       </w:r>
+    </w:p>
+    <w:tbl>
+      <w:tblPr>
+        <w:tblW w:type="auto" w:w="0"/>
+        <w:jc w:val="center"/>
+        <w:tblLayout w:type="fixed"/>
+        <w:tblLook w:firstColumn="1" w:firstRow="1" w:lastColumn="0" w:lastRow="0" w:noHBand="0" w:noVBand="1" w:val="04A0"/>
+      </w:tblPr>
+      <w:tblGrid>
+        <w:gridCol w:w="9173"/>
+      </w:tblGrid>
+      <w:tr>
+        <w:tc>
+          <w:tcPr>
+            <w:tcW w:type="dxa" w:w="9173"/>
+            <w:shd w:fill="F5F5F7"/>
+            <w:tcMar>
+              <w:top w:w="200" w:type="dxa"/>
+              <w:bottom w:w="200" w:type="dxa"/>
+              <w:left w:w="260" w:type="dxa"/>
+              <w:right w:w="260" w:type="dxa"/>
+            </w:tcMar>
+            <w:tcBorders>
+              <w:left w:val="single" w:sz="24" w:space="0" w:color="0F6E56"/>
+              <w:top w:val="none"/>
+              <w:right w:val="none"/>
+              <w:bottom w:val="none"/>
+            </w:tcBorders>
+          </w:tcPr>
+          <w:p>
+            <w:pPr>
+              <w:spacing w:after="40" w:line="312" w:lineRule="auto"/>
+            </w:pPr>
+            <w:r>
+              <w:rPr>
+                <w:rFonts w:ascii="Helvetica Neue" w:hAnsi="Helvetica Neue"/>
+                <w:b/>
+                <w:color w:val="1D1D1F"/>
+                <w:sz w:val="22"/>
+              </w:rPr>
+              <w:t>„Um Punkt zwölf Uhr saßen beide gemeinsam beim Mittagessen in der Sonne. Der Vormittag war perfekt – und vor ihnen lag noch eine volle Woche reiner, gemeinsamer Bergurlaub.“</w:t>
+            </w:r>
+          </w:p>
+          <w:p>
+            <w:pPr>
+              <w:spacing w:before="80" w:after="0"/>
+            </w:pPr>
+            <w:r>
+              <w:rPr>
+                <w:rFonts w:ascii="Helvetica Neue" w:hAnsi="Helvetica Neue"/>
+                <w:color w:val="6E6E73"/>
+                <w:sz w:val="18"/>
+              </w:rPr>
+              <w:t>Notiz zum Samstag: Maximale Erholung für beide, null Organisationsstress.</w:t>
+            </w:r>
+          </w:p>
+        </w:tc>
+      </w:tr>
+    </w:tbl>
+    <w:p>
+      <w:pPr>
+        <w:spacing w:before="160" w:after="0"/>
+      </w:pPr>
     </w:p>
     <w:p>
       <w:pPr>
-        <w:spacing w:line="300" w:lineRule="auto" w:after="140"/>
-        <w:jc w:val="both"/>
+        <w:keepNext/>
+        <w:spacing w:before="480" w:after="80"/>
       </w:pPr>
       <w:r>
         <w:rPr>
-          <w:rFonts w:ascii="Georgia" w:hAnsi="Georgia"/>
-          <w:color w:val="282828"/>
-          <w:sz w:val="22"/>
+          <w:rFonts w:ascii="Helvetica Neue" w:hAnsi="Helvetica Neue"/>
+          <w:b/>
+          <w:color w:val="0F6E56"/>
+          <w:sz w:val="17"/>
         </w:rPr>
-        <w:t>Um Punkt 12:00 Uhr saßen beide gemeinsam beim Mittagessen in der Sonne. Der sportliche Teil war erledigt, die Beine fühlten sich leicht an, und vor ihnen lag noch eine volle Woche gemeinsames Bergvergnügen.</w:t>
+        <w:t>STATION 05 · SCHWÄBISCHE ALB</w:t>
       </w:r>
     </w:p>
     <w:p>
       <w:pPr>
         <w:keepNext/>
-        <w:spacing w:before="440" w:after="160"/>
+        <w:spacing w:before="80" w:after="240"/>
       </w:pPr>
       <w:r>
         <w:rPr>
-          <w:rFonts w:ascii="Helvetica" w:hAnsi="Helvetica"/>
+          <w:rFonts w:ascii="Helvetica Neue" w:hAnsi="Helvetica Neue"/>
           <w:b/>
-          <w:color w:val="224C44"/>
-          <w:sz w:val="30"/>
+          <w:color w:val="1D1D1F"/>
+          <w:sz w:val="56"/>
         </w:rPr>
-        <w:t>5. Das Urzeit-Finale auf dem Heimweg</w:t>
+        <w:t>180 Millionen Jahre</w:t>
+      </w:r>
+      <w:r>
+        <w:rPr>
+          <w:rFonts w:ascii="Helvetica Neue" w:hAnsi="Helvetica Neue"/>
+          <w:b w:val="0"/>
+          <w:color w:val="6E6E73"/>
+          <w:sz w:val="56"/>
+        </w:rPr>
+        <w:t xml:space="preserve"> zum Dessert.</w:t>
       </w:r>
     </w:p>
     <w:p>
       <w:pPr>
-        <w:spacing w:line="300" w:lineRule="auto" w:after="140"/>
-        <w:jc w:val="both"/>
+        <w:spacing w:after="180" w:line="324" w:lineRule="auto"/>
       </w:pPr>
       <w:r>
         <w:rPr>
-          <w:rFonts w:ascii="Georgia" w:hAnsi="Georgia"/>
-          <w:color w:val="282828"/>
-          <w:sz w:val="22"/>
+          <w:rFonts w:ascii="Helvetica Neue" w:hAnsi="Helvetica Neue"/>
+          <w:color w:val="1D1D1F"/>
+          <w:sz w:val="21"/>
         </w:rPr>
-        <w:t>Nach zwei Wochen packten die beiden ihre rollende Höhle wieder ein. Aber anstatt einfach nur auf der Teerstraße nach Norden zu hasten, wartete auf der Schwäbischen Alb noch eine standesgemäße Zeitreise:</w:t>
+        <w:t>Nach zwei Wochen rollte die Höhle auf Rädern wieder nordwärts. Doch statt zäher Autobahnmeilen wartete nach gut zwei Stunden Fahrt an der Schwäbischen Alb das spektakuläre Finale:</w:t>
       </w:r>
     </w:p>
     <w:p>
       <w:pPr>
-        <w:spacing w:line="300" w:lineRule="auto" w:after="140"/>
-        <w:jc w:val="both"/>
+        <w:spacing w:after="180" w:line="324" w:lineRule="auto"/>
       </w:pPr>
       <w:r>
         <w:rPr>
-          <w:rFonts w:ascii="Georgia" w:hAnsi="Georgia"/>
-          <w:color w:val="282828"/>
-          <w:sz w:val="22"/>
+          <w:rFonts w:ascii="Helvetica Neue" w:hAnsi="Helvetica Neue"/>
+          <w:color w:val="1D1D1F"/>
+          <w:sz w:val="21"/>
         </w:rPr>
-        <w:t>In Holzmaden bogen sie ab und besuchten das Museum von Meister Hauff. Dort standen die beiden Neandertaler staunend vor den riesigen, 180 Millionen Jahre alten Fischsauriern, die im schwarzen Schiefer verewigt waren, und vor einer gigantischen versteinerten Seelilien-Wand, die schöner war als jedes moderne Gemälde.</w:t>
+        <w:t>In Holzmaden hielten sie am Urwelt-Museum Hauff. Dort standen die beiden Neandertaler staunend vor den weltberühmten, meterlangen Fischsauriern mit erhaltenen Hautumrissen und vor der gigantischen, hundert Quadratmeter großen versteinerten Seelilienwand – Erdgeschichte, die an den Wänden wie zeitgenössische Skulpturen wirkte.</w:t>
       </w:r>
     </w:p>
     <w:p>
       <w:pPr>
-        <w:spacing w:line="300" w:lineRule="auto" w:after="140"/>
-        <w:jc w:val="both"/>
+        <w:spacing w:after="180" w:line="324" w:lineRule="auto"/>
       </w:pPr>
       <w:r>
         <w:rPr>
-          <w:rFonts w:ascii="Georgia" w:hAnsi="Georgia"/>
-          <w:color w:val="282828"/>
-          <w:sz w:val="22"/>
+          <w:rFonts w:ascii="Helvetica Neue" w:hAnsi="Helvetica Neue"/>
+          <w:color w:val="1D1D1F"/>
+          <w:sz w:val="21"/>
         </w:rPr>
-        <w:t>Nach einer großen Portion schwäbischer Teigtaschen rollten sie am späten Nachmittag zurück in ihr heimisches Tal an der Düssel – erholt, satt, voller Bergbilder im Kopf und mit dem sicheren Gefühl, dass dies die beste Reise war, die zwei Neandertaler je unternommen hatten.</w:t>
+        <w:t>Nach einem Teller hausgemachter schwäbischer Maultaschen traten sie die letzten Kilometer an. Sie erreichten das heimatliche Tal am späten Nachmittag – erholt, geerdet, mit Bergluft in der Lunge und dem gemeinsamen Entschluss: Das war die beste Reise seit der Eiszeit.</w:t>
       </w:r>
     </w:p>
     <w:p>
       <w:pPr>
-        <w:spacing w:before="240" w:after="80"/>
+        <w:keepNext/>
+        <w:spacing w:before="280" w:after="100"/>
         <w:jc w:val="center"/>
       </w:pPr>
       <w:r>
         <w:drawing>
           <wp:inline xmlns:a="http://schemas.openxmlformats.org/drawingml/2006/main" xmlns:pic="http://schemas.openxmlformats.org/drawingml/2006/picture">
-            <wp:extent cx="5303520" cy="7965237"/>
+            <wp:extent cx="5824728" cy="8748027"/>
             <wp:docPr id="5" name="Picture 5"/>
             <wp:cNvGraphicFramePr>
               <a:graphicFrameLocks noChangeAspect="1"/>
@@ -707,7 +871,7 @@
                   <pic:spPr>
                     <a:xfrm>
                       <a:off x="0" y="0"/>
-                      <a:ext cx="5303520" cy="7965237"/>
+                      <a:ext cx="5824728" cy="8748027"/>
                     </a:xfrm>
                     <a:prstGeom prst="rect"/>
                   </pic:spPr>
@@ -720,32 +884,39 @@
     </w:p>
     <w:p>
       <w:pPr>
-        <w:spacing w:after="280"/>
-        <w:jc w:val="center"/>
+        <w:spacing w:after="360" w:line="276" w:lineRule="auto"/>
       </w:pPr>
       <w:r>
         <w:rPr>
-          <w:rFonts w:ascii="Helvetica" w:hAnsi="Helvetica"/>
-          <w:i/>
+          <w:rFonts w:ascii="Helvetica Neue" w:hAnsi="Helvetica Neue"/>
+          <w:b/>
+          <w:color w:val="1D1D1F"/>
+          <w:sz w:val="17"/>
+        </w:rPr>
+        <w:t xml:space="preserve">Urwelt-Museum Hauff.  </w:t>
+      </w:r>
+      <w:r>
+        <w:rPr>
+          <w:rFonts w:ascii="Helvetica Neue" w:hAnsi="Helvetica Neue"/>
           <w:color w:val="6E6E73"/>
-          <w:sz w:val="18"/>
+          <w:sz w:val="17"/>
         </w:rPr>
-        <w:t>180 Millionen Jahre Erdgeschichte: Die monumentale Seelilienwand im Urwelt-Museum Hauff.</w:t>
+        <w:t>Versteinerte Seelilienkolonie aus dem Posidonienschiefer.</w:t>
       </w:r>
     </w:p>
     <w:p>
       <w:pPr>
         <w:keepNext/>
-        <w:spacing w:before="480" w:after="120"/>
+        <w:spacing w:before="560" w:after="160"/>
       </w:pPr>
       <w:r>
         <w:rPr>
-          <w:rFonts w:ascii="Helvetica" w:hAnsi="Helvetica"/>
+          <w:rFonts w:ascii="Helvetica Neue" w:hAnsi="Helvetica Neue"/>
           <w:b/>
-          <w:color w:val="224C44"/>
-          <w:sz w:val="22"/>
+          <w:color w:val="0F6E56"/>
+          <w:sz w:val="18"/>
         </w:rPr>
-        <w:t>📋 DIE EXPEDITIONSDATEN AUF EINEN BLICK</w:t>
+        <w:t>REISE-SPEZIFIKATION · IM DETAIL</w:t>
       </w:r>
     </w:p>
     <w:tbl>
@@ -756,44 +927,58 @@
         <w:tblLook w:firstColumn="1" w:firstRow="1" w:lastColumn="0" w:lastRow="0" w:noHBand="0" w:noVBand="1" w:val="04A0"/>
       </w:tblPr>
       <w:tblGrid>
-        <w:gridCol w:w="4680"/>
-        <w:gridCol w:w="4680"/>
+        <w:gridCol w:w="4586"/>
+        <w:gridCol w:w="4586"/>
       </w:tblGrid>
       <w:tr>
         <w:tc>
           <w:tcPr>
-            <w:tcW w:type="dxa" w:w="2880"/>
+            <w:tcW w:type="dxa" w:w="2592"/>
+            <w:shd w:fill="F5F5F7"/>
+            <w:tcMar>
+              <w:top w:w="130" w:type="dxa"/>
+              <w:bottom w:w="130" w:type="dxa"/>
+              <w:left w:w="180" w:type="dxa"/>
+              <w:right w:w="180" w:type="dxa"/>
+            </w:tcMar>
           </w:tcPr>
           <w:p>
             <w:pPr>
-              <w:spacing w:after="60"/>
+              <w:spacing w:after="0"/>
             </w:pPr>
             <w:r>
               <w:rPr>
-                <w:rFonts w:ascii="Helvetica" w:hAnsi="Helvetica"/>
+                <w:rFonts w:ascii="Helvetica Neue" w:hAnsi="Helvetica Neue"/>
                 <w:b/>
-                <w:color w:val="224C44"/>
-                <w:sz w:val="19"/>
+                <w:color w:val="1D1D1F"/>
+                <w:sz w:val="18"/>
               </w:rPr>
-              <w:t>Reisezeitraum</w:t>
+              <w:t>Zeitfenster</w:t>
             </w:r>
           </w:p>
         </w:tc>
         <w:tc>
           <w:tcPr>
-            <w:tcW w:type="dxa" w:w="6480"/>
+            <w:tcW w:type="dxa" w:w="6581"/>
+            <w:shd w:fill="F5F5F7"/>
+            <w:tcMar>
+              <w:top w:w="130" w:type="dxa"/>
+              <w:bottom w:w="130" w:type="dxa"/>
+              <w:left w:w="180" w:type="dxa"/>
+              <w:right w:w="180" w:type="dxa"/>
+            </w:tcMar>
           </w:tcPr>
           <w:p>
             <w:pPr>
-              <w:spacing w:after="60"/>
+              <w:spacing w:after="0" w:line="288" w:lineRule="auto"/>
             </w:pPr>
             <w:r>
               <w:rPr>
-                <w:rFonts w:ascii="Georgia" w:hAnsi="Georgia"/>
-                <w:color w:val="282828"/>
-                <w:sz w:val="19"/>
+                <w:rFonts w:ascii="Helvetica Neue" w:hAnsi="Helvetica Neue"/>
+                <w:color w:val="1D1D1F"/>
+                <w:sz w:val="18"/>
               </w:rPr>
-              <w:t>Mitte Juni (Frühsommer ohne Hitzeglocke &amp; vor den Schulferien)</w:t>
+              <w:t>Mitte Juni (Frühsommerliche Frische, Tagestemperaturen 18–22 °C, vor den Schulferien)</w:t>
             </w:r>
           </w:p>
         </w:tc>
@@ -801,18 +986,25 @@
       <w:tr>
         <w:tc>
           <w:tcPr>
-            <w:tcW w:type="dxa" w:w="2880"/>
+            <w:tcW w:type="dxa" w:w="2592"/>
+            <w:shd w:fill="FFFFFF"/>
+            <w:tcMar>
+              <w:top w:w="130" w:type="dxa"/>
+              <w:bottom w:w="130" w:type="dxa"/>
+              <w:left w:w="180" w:type="dxa"/>
+              <w:right w:w="180" w:type="dxa"/>
+            </w:tcMar>
           </w:tcPr>
           <w:p>
             <w:pPr>
-              <w:spacing w:after="60"/>
+              <w:spacing w:after="0"/>
             </w:pPr>
             <w:r>
               <w:rPr>
-                <w:rFonts w:ascii="Helvetica" w:hAnsi="Helvetica"/>
+                <w:rFonts w:ascii="Helvetica Neue" w:hAnsi="Helvetica Neue"/>
                 <w:b/>
-                <w:color w:val="224C44"/>
-                <w:sz w:val="19"/>
+                <w:color w:val="1D1D1F"/>
+                <w:sz w:val="18"/>
               </w:rPr>
               <w:t>Reiseroute</w:t>
             </w:r>
@@ -820,17 +1012,24 @@
         </w:tc>
         <w:tc>
           <w:tcPr>
-            <w:tcW w:type="dxa" w:w="6480"/>
+            <w:tcW w:type="dxa" w:w="6581"/>
+            <w:shd w:fill="FFFFFF"/>
+            <w:tcMar>
+              <w:top w:w="130" w:type="dxa"/>
+              <w:bottom w:w="130" w:type="dxa"/>
+              <w:left w:w="180" w:type="dxa"/>
+              <w:right w:w="180" w:type="dxa"/>
+            </w:tcMar>
           </w:tcPr>
           <w:p>
             <w:pPr>
-              <w:spacing w:after="60"/>
+              <w:spacing w:after="0" w:line="288" w:lineRule="auto"/>
             </w:pPr>
             <w:r>
               <w:rPr>
-                <w:rFonts w:ascii="Georgia" w:hAnsi="Georgia"/>
-                <w:color w:val="282828"/>
-                <w:sz w:val="19"/>
+                <w:rFonts w:ascii="Helvetica Neue" w:hAnsi="Helvetica Neue"/>
+                <w:color w:val="1D1D1F"/>
+                <w:sz w:val="18"/>
               </w:rPr>
               <w:t>Düsseldorf ➔ Lindau (Bodensee) ➔ Imst (Tirol) ➔ Holzmaden ➔ Düsseldorf</w:t>
             </w:r>
@@ -840,18 +1039,78 @@
       <w:tr>
         <w:tc>
           <w:tcPr>
-            <w:tcW w:type="dxa" w:w="2880"/>
+            <w:tcW w:type="dxa" w:w="2592"/>
+            <w:shd w:fill="F5F5F7"/>
+            <w:tcMar>
+              <w:top w:w="130" w:type="dxa"/>
+              <w:bottom w:w="130" w:type="dxa"/>
+              <w:left w:w="180" w:type="dxa"/>
+              <w:right w:w="180" w:type="dxa"/>
+            </w:tcMar>
           </w:tcPr>
           <w:p>
             <w:pPr>
-              <w:spacing w:after="60"/>
+              <w:spacing w:after="0"/>
             </w:pPr>
             <w:r>
               <w:rPr>
-                <w:rFonts w:ascii="Helvetica" w:hAnsi="Helvetica"/>
+                <w:rFonts w:ascii="Helvetica Neue" w:hAnsi="Helvetica Neue"/>
                 <w:b/>
-                <w:color w:val="224C44"/>
-                <w:sz w:val="19"/>
+                <w:color w:val="1D1D1F"/>
+                <w:sz w:val="18"/>
+              </w:rPr>
+              <w:t>Etappenzeit</w:t>
+            </w:r>
+          </w:p>
+        </w:tc>
+        <w:tc>
+          <w:tcPr>
+            <w:tcW w:type="dxa" w:w="6581"/>
+            <w:shd w:fill="F5F5F7"/>
+            <w:tcMar>
+              <w:top w:w="130" w:type="dxa"/>
+              <w:bottom w:w="130" w:type="dxa"/>
+              <w:left w:w="180" w:type="dxa"/>
+              <w:right w:w="180" w:type="dxa"/>
+            </w:tcMar>
+          </w:tcPr>
+          <w:p>
+            <w:pPr>
+              <w:spacing w:after="0" w:line="288" w:lineRule="auto"/>
+            </w:pPr>
+            <w:r>
+              <w:rPr>
+                <w:rFonts w:ascii="Helvetica Neue" w:hAnsi="Helvetica Neue"/>
+                <w:color w:val="1D1D1F"/>
+                <w:sz w:val="18"/>
+              </w:rPr>
+              <w:t>Hinfahrt: 5,5 h nach Lindau, danach nur 1,5 h nach Imst. Rückfahrt: 2,2 h nach Holzmaden, 4,0 h nach DUS.</w:t>
+            </w:r>
+          </w:p>
+        </w:tc>
+      </w:tr>
+      <w:tr>
+        <w:tc>
+          <w:tcPr>
+            <w:tcW w:type="dxa" w:w="2592"/>
+            <w:shd w:fill="FFFFFF"/>
+            <w:tcMar>
+              <w:top w:w="130" w:type="dxa"/>
+              <w:bottom w:w="130" w:type="dxa"/>
+              <w:left w:w="180" w:type="dxa"/>
+              <w:right w:w="180" w:type="dxa"/>
+            </w:tcMar>
+          </w:tcPr>
+          <w:p>
+            <w:pPr>
+              <w:spacing w:after="0"/>
+            </w:pPr>
+            <w:r>
+              <w:rPr>
+                <w:rFonts w:ascii="Helvetica Neue" w:hAnsi="Helvetica Neue"/>
+                <w:b/>
+                <w:color w:val="1D1D1F"/>
+                <w:sz w:val="18"/>
               </w:rPr>
               <w:t>Basislager</w:t>
             </w:r>
@@ -859,19 +1118,26 @@
         </w:tc>
         <w:tc>
           <w:tcPr>
-            <w:tcW w:type="dxa" w:w="6480"/>
+            <w:tcW w:type="dxa" w:w="6581"/>
+            <w:shd w:fill="FFFFFF"/>
+            <w:tcMar>
+              <w:top w:w="130" w:type="dxa"/>
+              <w:bottom w:w="130" w:type="dxa"/>
+              <w:left w:w="180" w:type="dxa"/>
+              <w:right w:w="180" w:type="dxa"/>
+            </w:tcMar>
           </w:tcPr>
           <w:p>
             <w:pPr>
-              <w:spacing w:after="60"/>
+              <w:spacing w:after="0" w:line="288" w:lineRule="auto"/>
             </w:pPr>
             <w:r>
               <w:rPr>
-                <w:rFonts w:ascii="Georgia" w:hAnsi="Georgia"/>
-                <w:color w:val="282828"/>
-                <w:sz w:val="19"/>
+                <w:rFonts w:ascii="Helvetica Neue" w:hAnsi="Helvetica Neue"/>
+                <w:color w:val="1D1D1F"/>
+                <w:sz w:val="18"/>
               </w:rPr>
-              <w:t>Campingpark FiNK in Imst (klein, ruhig, top-gepflegt, Bergblick)</w:t>
+              <w:t>Campingpark FiNK in Imst (klein, ruhig, top-moderne Sanitäranlagen, Bergblick, fußläufiger Bäcker)</w:t>
             </w:r>
           </w:p>
         </w:tc>
@@ -879,38 +1145,52 @@
       <w:tr>
         <w:tc>
           <w:tcPr>
-            <w:tcW w:type="dxa" w:w="2880"/>
+            <w:tcW w:type="dxa" w:w="2592"/>
+            <w:shd w:fill="F5F5F7"/>
+            <w:tcMar>
+              <w:top w:w="130" w:type="dxa"/>
+              <w:bottom w:w="130" w:type="dxa"/>
+              <w:left w:w="180" w:type="dxa"/>
+              <w:right w:w="180" w:type="dxa"/>
+            </w:tcMar>
           </w:tcPr>
           <w:p>
             <w:pPr>
-              <w:spacing w:after="60"/>
+              <w:spacing w:after="0"/>
             </w:pPr>
             <w:r>
               <w:rPr>
-                <w:rFonts w:ascii="Helvetica" w:hAnsi="Helvetica"/>
+                <w:rFonts w:ascii="Helvetica Neue" w:hAnsi="Helvetica Neue"/>
                 <w:b/>
-                <w:color w:val="224C44"/>
-                <w:sz w:val="19"/>
+                <w:color w:val="1D1D1F"/>
+                <w:sz w:val="18"/>
               </w:rPr>
-              <w:t>Wandern zu zweit</w:t>
+              <w:t>Wander-Profil</w:t>
             </w:r>
           </w:p>
         </w:tc>
         <w:tc>
           <w:tcPr>
-            <w:tcW w:type="dxa" w:w="6480"/>
+            <w:tcW w:type="dxa" w:w="6581"/>
+            <w:shd w:fill="F5F5F7"/>
+            <w:tcMar>
+              <w:top w:w="130" w:type="dxa"/>
+              <w:bottom w:w="130" w:type="dxa"/>
+              <w:left w:w="180" w:type="dxa"/>
+              <w:right w:w="180" w:type="dxa"/>
+            </w:tcMar>
           </w:tcPr>
           <w:p>
             <w:pPr>
-              <w:spacing w:after="60"/>
+              <w:spacing w:after="0" w:line="288" w:lineRule="auto"/>
             </w:pPr>
             <w:r>
               <w:rPr>
-                <w:rFonts w:ascii="Georgia" w:hAnsi="Georgia"/>
-                <w:color w:val="282828"/>
-                <w:sz w:val="19"/>
+                <w:rFonts w:ascii="Helvetica Neue" w:hAnsi="Helvetica Neue"/>
+                <w:color w:val="1D1D1F"/>
+                <w:sz w:val="18"/>
               </w:rPr>
-              <w:t>4–5 Std. / 500–700 Hm (Rosengartenschlucht, Piburger See, Zirbenweg)</w:t>
+              <w:t>4 bis 5 Stunden / 500 bis 700 Höhenmeter (T2, schattige Schluchten, warme Waldseen, Almen)</w:t>
             </w:r>
           </w:p>
         </w:tc>
@@ -918,38 +1198,52 @@
       <w:tr>
         <w:tc>
           <w:tcPr>
-            <w:tcW w:type="dxa" w:w="2880"/>
+            <w:tcW w:type="dxa" w:w="2592"/>
+            <w:shd w:fill="FFFFFF"/>
+            <w:tcMar>
+              <w:top w:w="130" w:type="dxa"/>
+              <w:bottom w:w="130" w:type="dxa"/>
+              <w:left w:w="180" w:type="dxa"/>
+              <w:right w:w="180" w:type="dxa"/>
+            </w:tcMar>
           </w:tcPr>
           <w:p>
             <w:pPr>
-              <w:spacing w:after="60"/>
+              <w:spacing w:after="0"/>
             </w:pPr>
             <w:r>
               <w:rPr>
-                <w:rFonts w:ascii="Helvetica" w:hAnsi="Helvetica"/>
+                <w:rFonts w:ascii="Helvetica Neue" w:hAnsi="Helvetica Neue"/>
                 <w:b/>
-                <w:color w:val="224C44"/>
-                <w:sz w:val="19"/>
+                <w:color w:val="1D1D1F"/>
+                <w:sz w:val="18"/>
               </w:rPr>
-              <w:t>Kultur &amp; Kulinarik</w:t>
+              <w:t>Kultur-Trilogie</w:t>
             </w:r>
           </w:p>
         </w:tc>
         <w:tc>
           <w:tcPr>
-            <w:tcW w:type="dxa" w:w="6480"/>
+            <w:tcW w:type="dxa" w:w="6581"/>
+            <w:shd w:fill="FFFFFF"/>
+            <w:tcMar>
+              <w:top w:w="130" w:type="dxa"/>
+              <w:bottom w:w="130" w:type="dxa"/>
+              <w:left w:w="180" w:type="dxa"/>
+              <w:right w:w="180" w:type="dxa"/>
+            </w:tcMar>
           </w:tcPr>
           <w:p>
             <w:pPr>
-              <w:spacing w:after="60"/>
+              <w:spacing w:after="0" w:line="288" w:lineRule="auto"/>
             </w:pPr>
             <w:r>
               <w:rPr>
-                <w:rFonts w:ascii="Georgia" w:hAnsi="Georgia"/>
-                <w:color w:val="282828"/>
-                <w:sz w:val="19"/>
+                <w:rFonts w:ascii="Helvetica Neue" w:hAnsi="Helvetica Neue"/>
+                <w:color w:val="1D1D1F"/>
+                <w:sz w:val="18"/>
               </w:rPr>
-              <w:t>Archäologie (Piller Sattel &amp; Ötzi), Zaha Hadid in Innsbruck, Kaiserschmarrn</w:t>
+              <w:t>Urweltmuseum Hauff (Paläontologie), Piller Sattel &amp; Ötzi (Archäologie), Zaha Hadid (Baukunst)</w:t>
             </w:r>
           </w:p>
         </w:tc>
@@ -957,46 +1251,60 @@
       <w:tr>
         <w:tc>
           <w:tcPr>
-            <w:tcW w:type="dxa" w:w="2880"/>
+            <w:tcW w:type="dxa" w:w="2592"/>
+            <w:shd w:fill="F5F5F7"/>
+            <w:tcMar>
+              <w:top w:w="130" w:type="dxa"/>
+              <w:bottom w:w="130" w:type="dxa"/>
+              <w:left w:w="180" w:type="dxa"/>
+              <w:right w:w="180" w:type="dxa"/>
+            </w:tcMar>
           </w:tcPr>
           <w:p>
             <w:pPr>
-              <w:spacing w:after="60"/>
+              <w:spacing w:after="0"/>
             </w:pPr>
             <w:r>
               <w:rPr>
-                <w:rFonts w:ascii="Helvetica" w:hAnsi="Helvetica"/>
+                <w:rFonts w:ascii="Helvetica Neue" w:hAnsi="Helvetica Neue"/>
                 <w:b/>
-                <w:color w:val="224C44"/>
-                <w:sz w:val="19"/>
+                <w:color w:val="1D1D1F"/>
+                <w:sz w:val="18"/>
               </w:rPr>
-              <w:t>Der Samstagslauf</w:t>
+              <w:t>Das Samstag-Extra</w:t>
             </w:r>
           </w:p>
         </w:tc>
         <w:tc>
           <w:tcPr>
-            <w:tcW w:type="dxa" w:w="6480"/>
+            <w:tcW w:type="dxa" w:w="6581"/>
+            <w:shd w:fill="F5F5F7"/>
+            <w:tcMar>
+              <w:top w:w="130" w:type="dxa"/>
+              <w:bottom w:w="130" w:type="dxa"/>
+              <w:left w:w="180" w:type="dxa"/>
+              <w:right w:w="180" w:type="dxa"/>
+            </w:tcMar>
           </w:tcPr>
           <w:p>
             <w:pPr>
-              <w:spacing w:after="60"/>
+              <w:spacing w:after="0" w:line="288" w:lineRule="auto"/>
             </w:pPr>
             <w:r>
               <w:rPr>
-                <w:rFonts w:ascii="Georgia" w:hAnsi="Georgia"/>
-                <w:color w:val="282828"/>
-                <w:sz w:val="19"/>
+                <w:rFonts w:ascii="Helvetica Neue" w:hAnsi="Helvetica Neue"/>
+                <w:color w:val="1D1D1F"/>
+                <w:sz w:val="18"/>
               </w:rPr>
-              <w:t>16,9 km / 800 Hm TS16 (35 € Startgeld, vor dem Mittagessen beendet)</w:t>
+              <w:t>TS16 Adventure (16,9 km / 800 Hm für 35 € Startgeld; um 11:30 Uhr geduscht beendet)</w:t>
             </w:r>
           </w:p>
         </w:tc>
       </w:tr>
     </w:tbl>
     <w:sectPr>
-      <w:pgSz w:w="12240" w:h="15840"/>
-      <w:pgMar w:top="1440" w:right="1440" w:bottom="1440" w:left="1440" w:header="720" w:footer="720" w:gutter="0"/>
+      <w:pgSz w:w="11909" w:h="16834"/>
+      <w:pgMar w:top="1368" w:right="1368" w:bottom="1368" w:left="1368" w:header="720" w:footer="720" w:gutter="0"/>
       <w:cols w:space="720"/>
       <w:docGrid w:linePitch="360"/>
     </w:sectPr>

</xml_diff>

<commit_message>
Redesign Die_Reise_der_zwei_Neandertaler as vintage 1950s DIN A5 travel guide (5 pages)
</commit_message>
<xml_diff>
--- a/Die_Reise_der_zwei_Neandertaler.docx
+++ b/Die_Reise_der_zwei_Neandertaler.docx
@@ -4,156 +4,141 @@
   <w:body>
     <w:p>
       <w:pPr>
-        <w:keepNext/>
-        <w:spacing w:before="200" w:after="80"/>
+        <w:spacing w:before="80" w:after="40"/>
+        <w:jc w:val="center"/>
       </w:pPr>
       <w:r>
         <w:rPr>
-          <w:rFonts w:ascii="Helvetica Neue" w:hAnsi="Helvetica Neue"/>
+          <w:rFonts w:ascii="Baskerville" w:hAnsi="Baskerville"/>
           <w:b/>
-          <w:color w:val="0F6E56"/>
-          <w:sz w:val="17"/>
+          <w:color w:val="801C24"/>
+          <w:sz w:val="16"/>
         </w:rPr>
-        <w:t>APPLE STUDIO EDITORIAL · REISEDOSSIER JUNI 2027</w:t>
+        <w:t>GRIEBENS REISEFÜHRER · BAND 1927</w:t>
+      </w:r>
+    </w:p>
+    <w:p>
+      <w:pPr>
+        <w:spacing w:after="160"/>
+        <w:jc w:val="center"/>
+      </w:pPr>
+      <w:r>
+        <w:rPr>
+          <w:rFonts w:ascii="Garamond" w:hAnsi="Garamond"/>
+          <w:color w:val="554B46"/>
+          <w:sz w:val="12"/>
+        </w:rPr>
+        <w:t>══════════════════════════════════════</w:t>
+      </w:r>
+    </w:p>
+    <w:p>
+      <w:pPr>
+        <w:spacing w:after="120"/>
+        <w:jc w:val="center"/>
+      </w:pPr>
+      <w:r>
+        <w:rPr>
+          <w:rFonts w:ascii="Baskerville" w:hAnsi="Baskerville"/>
+          <w:b/>
+          <w:color w:val="1E1E1E"/>
+          <w:sz w:val="34"/>
+        </w:rPr>
+        <w:t>Zwei Neandertaler auf Sommerfahrt</w:t>
+      </w:r>
+    </w:p>
+    <w:p>
+      <w:pPr>
+        <w:spacing w:after="160"/>
+        <w:jc w:val="center"/>
+      </w:pPr>
+      <w:r>
+        <w:rPr>
+          <w:rFonts w:ascii="Garamond" w:hAnsi="Garamond"/>
+          <w:i/>
+          <w:color w:val="554B46"/>
+          <w:sz w:val="20"/>
+        </w:rPr>
+        <w:t>Praktischer Wegweiser durch das Oberinntal nebst eingehender Schilderung einer zweiwöchigen Kraftwagenreise im Juni.</w:t>
+      </w:r>
+    </w:p>
+    <w:p>
+      <w:pPr>
+        <w:spacing w:after="240"/>
+        <w:jc w:val="center"/>
+      </w:pPr>
+      <w:r>
+        <w:rPr>
+          <w:rFonts w:ascii="Garamond" w:hAnsi="Garamond"/>
+          <w:color w:val="554B46"/>
+          <w:sz w:val="12"/>
+        </w:rPr>
+        <w:t>——————————————————————————————————————</w:t>
       </w:r>
     </w:p>
     <w:p>
       <w:pPr>
         <w:keepNext/>
-        <w:spacing w:before="80" w:after="240"/>
+        <w:spacing w:before="240" w:after="80"/>
       </w:pPr>
       <w:r>
         <w:rPr>
-          <w:rFonts w:ascii="Helvetica Neue" w:hAnsi="Helvetica Neue"/>
+          <w:rFonts w:ascii="Baskerville" w:hAnsi="Baskerville"/>
           <w:b/>
-          <w:color w:val="1D1D1F"/>
-          <w:sz w:val="56"/>
+          <w:color w:val="801C24"/>
+          <w:sz w:val="23"/>
         </w:rPr>
-        <w:t>Zwei Neandertaler.</w:t>
+        <w:t xml:space="preserve">I.  </w:t>
       </w:r>
       <w:r>
         <w:rPr>
-          <w:rFonts w:ascii="Helvetica Neue" w:hAnsi="Helvetica Neue"/>
-          <w:b w:val="0"/>
-          <w:color w:val="6E6E73"/>
-          <w:sz w:val="56"/>
+          <w:rFonts w:ascii="Baskerville" w:hAnsi="Baskerville"/>
+          <w:b/>
+          <w:color w:val="1E1E1E"/>
+          <w:sz w:val="23"/>
         </w:rPr>
-        <w:t xml:space="preserve"> Auf großer Fahrt.</w:t>
+        <w:t>Vom Aufbruch und der Einkehr am Schwäbischen Meer</w:t>
       </w:r>
     </w:p>
     <w:p>
       <w:pPr>
-        <w:spacing w:after="280" w:line="324" w:lineRule="auto"/>
+        <w:spacing w:line="276" w:lineRule="auto" w:after="80"/>
+        <w:ind w:firstLine="0"/>
+        <w:jc w:val="both"/>
       </w:pPr>
       <w:r>
         <w:rPr>
-          <w:rFonts w:ascii="Helvetica Neue" w:hAnsi="Helvetica Neue"/>
-          <w:color w:val="1D1D1F"/>
-          <w:sz w:val="25"/>
+          <w:rFonts w:ascii="Garamond" w:hAnsi="Garamond"/>
+          <w:color w:val="1E1E1E"/>
+          <w:sz w:val="19"/>
         </w:rPr>
-        <w:t>Eine Erzählung über freie Autobahnen, alte Freunde am See, die Kühle alpiner Schluchten und einen vollkommen beiläufigen Samstagvormittag.</w:t>
+        <w:t>Es begab sich zur Mitte des Monats Juni, als zwei wohlbestallte Bewohner des heimatlichen Neandertals beschlossen, das heimatliche Düsseltal zeitweilig zu verlassen. Das Zeitalter der Mammutjagd war längst einer friedlichen Epoche gewichen; anstelle mühseliger Märsche zu Fuße stand ein moderner, trefflich ausgerüsteter Camping-Kraftwagen bereit, welcher Unabhängigkeit mit behaglicher Schlafstatt und eigener Kaffeeküche vereinte.</w:t>
       </w:r>
     </w:p>
     <w:p>
       <w:pPr>
-        <w:spacing w:after="320"/>
+        <w:spacing w:line="276" w:lineRule="auto" w:after="80"/>
+        <w:ind w:firstLine="288"/>
+        <w:jc w:val="both"/>
       </w:pPr>
       <w:r>
         <w:rPr>
-          <w:color w:val="E5E5EA"/>
-          <w:sz w:val="12"/>
+          <w:rFonts w:ascii="Garamond" w:hAnsi="Garamond"/>
+          <w:color w:val="1E1E1E"/>
+          <w:sz w:val="19"/>
         </w:rPr>
-        <w:t>_________________________________________________________________________________</w:t>
+        <w:t>Die Ausfahrt vollzog sich zu glücklichster Stunde: Da die Ferienscharen der Schulen noch daheim weilten, lagen die Reichs- und Fernstraßen still und frei. Nach geruhsamer Fahrt ward am Nachmittage Lindau am Bodensee erreicht. Wassertrübliche Sorgen gab es keine: Am Ufer ward Rast gehalten, um alten Stammesfreunden die Aufwartung zu machen. Bei frisch gefangenem Bodenseefisch, auserlesenem Weine und munteren Gesprächen bis in die kühlen Nachtstunden fand die Anreise ihren vollendeten Auftakt.</w:t>
       </w:r>
     </w:p>
     <w:p>
       <w:pPr>
         <w:keepNext/>
-        <w:spacing w:before="480" w:after="80"/>
-      </w:pPr>
-      <w:r>
-        <w:rPr>
-          <w:rFonts w:ascii="Helvetica Neue" w:hAnsi="Helvetica Neue"/>
-          <w:b/>
-          <w:color w:val="0F6E56"/>
-          <w:sz w:val="17"/>
-        </w:rPr>
-        <w:t>STATION 01 · BODENSEE</w:t>
-      </w:r>
-    </w:p>
-    <w:p>
-      <w:pPr>
-        <w:keepNext/>
-        <w:spacing w:before="80" w:after="240"/>
-      </w:pPr>
-      <w:r>
-        <w:rPr>
-          <w:rFonts w:ascii="Helvetica Neue" w:hAnsi="Helvetica Neue"/>
-          <w:b/>
-          <w:color w:val="1D1D1F"/>
-          <w:sz w:val="56"/>
-        </w:rPr>
-        <w:t>Das Wiedersehen</w:t>
-      </w:r>
-      <w:r>
-        <w:rPr>
-          <w:rFonts w:ascii="Helvetica Neue" w:hAnsi="Helvetica Neue"/>
-          <w:b w:val="0"/>
-          <w:color w:val="6E6E73"/>
-          <w:sz w:val="56"/>
-        </w:rPr>
-        <w:t xml:space="preserve"> am Wasser.</w:t>
-      </w:r>
-    </w:p>
-    <w:p>
-      <w:pPr>
-        <w:spacing w:after="180" w:line="324" w:lineRule="auto"/>
-      </w:pPr>
-      <w:r>
-        <w:rPr>
-          <w:rFonts w:ascii="Helvetica Neue" w:hAnsi="Helvetica Neue"/>
-          <w:color w:val="1D1D1F"/>
-          <w:sz w:val="21"/>
-        </w:rPr>
-        <w:t>Es war einmal Mitte Juni, als zwei kultivierte Neandertaler beschlossen, dass es im heimatlichen Tal an der Düssel zwar wunderschön war, die Welt hinter dem Horizont aber dringend erkundet werden musste.</w:t>
-      </w:r>
-    </w:p>
-    <w:p>
-      <w:pPr>
-        <w:spacing w:after="180" w:line="324" w:lineRule="auto"/>
-      </w:pPr>
-      <w:r>
-        <w:rPr>
-          <w:rFonts w:ascii="Helvetica Neue" w:hAnsi="Helvetica Neue"/>
-          <w:color w:val="1D1D1F"/>
-          <w:sz w:val="21"/>
-        </w:rPr>
-        <w:t>Das Mammut war längst ausgestorben, die Keulen standen im Schrank, und anstelle eines mühsamen Fußmarsches durchs Gestrüpp besaßen die beiden eine äußerst komfortable, moderne Höhle auf vier Rädern: ihren Camper. Darin gab es ein breites Bett, eine Kaffeemaschine und absolute Unabhängigkeit.</w:t>
-      </w:r>
-    </w:p>
-    <w:p>
-      <w:pPr>
-        <w:spacing w:after="180" w:line="324" w:lineRule="auto"/>
-      </w:pPr>
-      <w:r>
-        <w:rPr>
-          <w:rFonts w:ascii="Helvetica Neue" w:hAnsi="Helvetica Neue"/>
-          <w:color w:val="1D1D1F"/>
-          <w:sz w:val="21"/>
-        </w:rPr>
-        <w:t>Die Reise begann ganz ohne Völkerwanderungs-Hektik: Noch kein Bundesland hatte Schulferien, die Straßen waren leer. Am Nachmittag erreichten sie den Bodensee in Lindau. Camper abstellen, Freunde umarmen, den Sonnenuntergang über dem spiegelglatten Wasser beobachten, Bodenseefisch essen und alte Geschichten bei gutem Wein austauschen. Als die beiden am nächsten Morgen bei Seeblick frühstückten, war der Urlaub längst da.</w:t>
-      </w:r>
-    </w:p>
-    <w:p>
-      <w:pPr>
-        <w:keepNext/>
-        <w:spacing w:before="280" w:after="100"/>
+        <w:spacing w:before="160" w:after="60"/>
         <w:jc w:val="center"/>
       </w:pPr>
       <w:r>
         <w:drawing>
           <wp:inline xmlns:a="http://schemas.openxmlformats.org/drawingml/2006/main" xmlns:pic="http://schemas.openxmlformats.org/drawingml/2006/picture">
-            <wp:extent cx="5824728" cy="1936722"/>
+            <wp:extent cx="4023360" cy="1337767"/>
             <wp:docPr id="1" name="Picture 1"/>
             <wp:cNvGraphicFramePr>
               <a:graphicFrameLocks noChangeAspect="1"/>
@@ -174,7 +159,7 @@
                   <pic:spPr>
                     <a:xfrm>
                       <a:off x="0" y="0"/>
-                      <a:ext cx="5824728" cy="1936722"/>
+                      <a:ext cx="4023360" cy="1337767"/>
                     </a:xfrm>
                     <a:prstGeom prst="rect"/>
                   </pic:spPr>
@@ -187,101 +172,126 @@
     </w:p>
     <w:p>
       <w:pPr>
-        <w:spacing w:after="360" w:line="276" w:lineRule="auto"/>
+        <w:spacing w:after="200"/>
+        <w:jc w:val="center"/>
       </w:pPr>
       <w:r>
         <w:rPr>
-          <w:rFonts w:ascii="Helvetica Neue" w:hAnsi="Helvetica Neue"/>
+          <w:rFonts w:ascii="Baskerville" w:hAnsi="Baskerville"/>
           <w:b/>
-          <w:color w:val="1D1D1F"/>
-          <w:sz w:val="17"/>
+          <w:color w:val="801C24"/>
+          <w:sz w:val="16"/>
         </w:rPr>
-        <w:t xml:space="preserve">Lindau am Bodensee.  </w:t>
+        <w:t xml:space="preserve">Abb. 1: </w:t>
       </w:r>
       <w:r>
         <w:rPr>
-          <w:rFonts w:ascii="Helvetica Neue" w:hAnsi="Helvetica Neue"/>
-          <w:color w:val="6E6E73"/>
-          <w:sz w:val="17"/>
+          <w:rFonts w:ascii="Garamond" w:hAnsi="Garamond"/>
+          <w:i/>
+          <w:color w:val="554B46"/>
+          <w:sz w:val="16"/>
         </w:rPr>
-        <w:t>Hafenpromenade und Mangturm im warmen Abendlicht.</w:t>
+        <w:t>Hafeneinfahrt zu Lindau am Bodensee mit Leuchtturm und bayerischem Löwen im Abendlicht.</w:t>
+      </w:r>
+    </w:p>
+    <w:p>
+      <w:r>
+        <w:br w:type="page"/>
+      </w:r>
+    </w:p>
+    <w:p>
+      <w:pPr>
+        <w:spacing w:before="0" w:after="80"/>
+        <w:jc w:val="center"/>
+      </w:pPr>
+      <w:r>
+        <w:rPr>
+          <w:rFonts w:ascii="Baskerville" w:hAnsi="Baskerville"/>
+          <w:color w:val="966E32"/>
+          <w:sz w:val="18"/>
+        </w:rPr>
+        <w:t>— ❖ —</w:t>
       </w:r>
     </w:p>
     <w:p>
       <w:pPr>
         <w:keepNext/>
-        <w:spacing w:before="480" w:after="80"/>
+        <w:spacing w:before="240" w:after="80"/>
       </w:pPr>
       <w:r>
         <w:rPr>
-          <w:rFonts w:ascii="Helvetica Neue" w:hAnsi="Helvetica Neue"/>
+          <w:rFonts w:ascii="Baskerville" w:hAnsi="Baskerville"/>
           <w:b/>
-          <w:color w:val="0F6E56"/>
-          <w:sz w:val="17"/>
+          <w:color w:val="801C24"/>
+          <w:sz w:val="23"/>
         </w:rPr>
-        <w:t>STATION 02 · TIROLER INNTAL</w:t>
+        <w:t xml:space="preserve">II.  </w:t>
+      </w:r>
+      <w:r>
+        <w:rPr>
+          <w:rFonts w:ascii="Baskerville" w:hAnsi="Baskerville"/>
+          <w:b/>
+          <w:color w:val="1E1E1E"/>
+          <w:sz w:val="23"/>
+        </w:rPr>
+        <w:t>Vom Standlager zu Imst am Fuße der Lechtaler Alpen</w:t>
+      </w:r>
+    </w:p>
+    <w:p>
+      <w:pPr>
+        <w:spacing w:line="276" w:lineRule="auto" w:after="80"/>
+        <w:ind w:firstLine="0"/>
+        <w:jc w:val="both"/>
+      </w:pPr>
+      <w:r>
+        <w:rPr>
+          <w:rFonts w:ascii="Garamond" w:hAnsi="Garamond"/>
+          <w:color w:val="1E1E1E"/>
+          <w:sz w:val="19"/>
+        </w:rPr>
+        <w:t>Nach morgendlichem Mahle am Seeufer trennte die Reisenden lediglich eine verhältnismäßig kurze Fahrt von anderthalb Stunden über die Grenze von ihrem sommerlichen Hauptziel: dem Flecken Imst im Tiroler Oberlande. Eingebettet am Zusammenflusse des Gurgl- und Inntals bezogen die Wanderer ihr Standlager auf dem Campingpark FiNK.</w:t>
+      </w:r>
+    </w:p>
+    <w:p>
+      <w:pPr>
+        <w:spacing w:line="276" w:lineRule="auto" w:after="80"/>
+        <w:ind w:firstLine="288"/>
+        <w:jc w:val="both"/>
+      </w:pPr>
+      <w:r>
+        <w:rPr>
+          <w:rFonts w:ascii="Garamond" w:hAnsi="Garamond"/>
+          <w:color w:val="1E1E1E"/>
+          <w:sz w:val="19"/>
+        </w:rPr>
+        <w:t>Dieser Platz verdient das vollste Lob des Wanderers: fernab lärmender Vergnügungsstätten zeichnet er sich durch peinlichste Reinlichkeit der Bade- und Waschanstalten aus. Der örtliche Bäcker liefert in drei Gehminuten das frische Gebäck zur Frühstückstafel. Von der Lagerstatt blickt das Auge unmittelbar in die schroffen, grauen Felsabstürze des Imster Muttekopfs.</w:t>
+      </w:r>
+    </w:p>
+    <w:p>
+      <w:pPr>
+        <w:spacing w:line="276" w:lineRule="auto" w:after="80"/>
+        <w:ind w:firstLine="288"/>
+        <w:jc w:val="both"/>
+      </w:pPr>
+      <w:r>
+        <w:rPr>
+          <w:rFonts w:ascii="Garamond" w:hAnsi="Garamond"/>
+          <w:color w:val="1E1E1E"/>
+          <w:sz w:val="19"/>
+        </w:rPr>
+        <w:t>Das Thermometer wies zur Mittagsstunde milde zwanzig Wärmegrade auf, während die Nächte auf erfrischende zehn Grad abkühlten – ein wahrer Segen für den Wanderer, dem sommerliche Glut verhasst ist.</w:t>
       </w:r>
     </w:p>
     <w:p>
       <w:pPr>
         <w:keepNext/>
-        <w:spacing w:before="80" w:after="240"/>
-      </w:pPr>
-      <w:r>
-        <w:rPr>
-          <w:rFonts w:ascii="Helvetica Neue" w:hAnsi="Helvetica Neue"/>
-          <w:b/>
-          <w:color w:val="1D1D1F"/>
-          <w:sz w:val="56"/>
-        </w:rPr>
-        <w:t>Das Basislager</w:t>
-      </w:r>
-      <w:r>
-        <w:rPr>
-          <w:rFonts w:ascii="Helvetica Neue" w:hAnsi="Helvetica Neue"/>
-          <w:b w:val="0"/>
-          <w:color w:val="6E6E73"/>
-          <w:sz w:val="56"/>
-        </w:rPr>
-        <w:t xml:space="preserve"> unter den Wänden.</w:t>
-      </w:r>
-    </w:p>
-    <w:p>
-      <w:pPr>
-        <w:spacing w:after="180" w:line="324" w:lineRule="auto"/>
-      </w:pPr>
-      <w:r>
-        <w:rPr>
-          <w:rFonts w:ascii="Helvetica Neue" w:hAnsi="Helvetica Neue"/>
-          <w:color w:val="1D1D1F"/>
-          <w:sz w:val="21"/>
-        </w:rPr>
-        <w:t>Von Lindau aus waren es gerade einmal knapp anderthalb entspannte Fahrstunden hinauf ins Tiroler Oberland nach Imst. Umrahmt von gewaltigen, gezackten Kalksteinabstürzen bezogen sie Quartier auf dem Campingpark FiNK: ein kleiner, tadellos gepflegter Platz abseits großer Touristenburgen, mit beheizten Traumbädern, absoluter Stille und frischen Bäckerbrötchen in drei Gehminuten.</w:t>
-      </w:r>
-    </w:p>
-    <w:p>
-      <w:pPr>
-        <w:spacing w:after="180" w:line="324" w:lineRule="auto"/>
-      </w:pPr>
-      <w:r>
-        <w:rPr>
-          <w:rFonts w:ascii="Helvetica Neue" w:hAnsi="Helvetica Neue"/>
-          <w:color w:val="1D1D1F"/>
-          <w:sz w:val="21"/>
-        </w:rPr>
-        <w:t>Der größte Luxus im Juni: die Temperatur. Während unten im Tal angenehme 20 bis 22 Grad herrschten, kühlte es nachts zuverlässig auf frische 10 Grad ab. Keine Hitzeglocke, kein Schwitzen – stattdessen glasklare Bergluft ab dem ersten Atemzug am Morgen.</w:t>
-      </w:r>
-    </w:p>
-    <w:p>
-      <w:pPr>
-        <w:keepNext/>
-        <w:spacing w:before="280" w:after="100"/>
+        <w:spacing w:before="160" w:after="60"/>
         <w:jc w:val="center"/>
       </w:pPr>
       <w:r>
         <w:drawing>
           <wp:inline xmlns:a="http://schemas.openxmlformats.org/drawingml/2006/main" xmlns:pic="http://schemas.openxmlformats.org/drawingml/2006/picture">
-            <wp:extent cx="5824728" cy="7689410"/>
+            <wp:extent cx="4023360" cy="5311366"/>
             <wp:docPr id="2" name="Picture 2"/>
             <wp:cNvGraphicFramePr>
               <a:graphicFrameLocks noChangeAspect="1"/>
@@ -302,7 +312,7 @@
                   <pic:spPr>
                     <a:xfrm>
                       <a:off x="0" y="0"/>
-                      <a:ext cx="5824728" cy="7689410"/>
+                      <a:ext cx="4023360" cy="5311366"/>
                     </a:xfrm>
                     <a:prstGeom prst="rect"/>
                   </pic:spPr>
@@ -315,184 +325,111 @@
     </w:p>
     <w:p>
       <w:pPr>
-        <w:spacing w:after="360" w:line="276" w:lineRule="auto"/>
+        <w:spacing w:after="200"/>
+        <w:jc w:val="center"/>
       </w:pPr>
       <w:r>
         <w:rPr>
-          <w:rFonts w:ascii="Helvetica Neue" w:hAnsi="Helvetica Neue"/>
+          <w:rFonts w:ascii="Baskerville" w:hAnsi="Baskerville"/>
           <w:b/>
-          <w:color w:val="1D1D1F"/>
-          <w:sz w:val="17"/>
+          <w:color w:val="801C24"/>
+          <w:sz w:val="16"/>
         </w:rPr>
-        <w:t xml:space="preserve">Felskulisse über Imst.  </w:t>
+        <w:t xml:space="preserve">Abb. 2: </w:t>
       </w:r>
       <w:r>
         <w:rPr>
-          <w:rFonts w:ascii="Helvetica Neue" w:hAnsi="Helvetica Neue"/>
-          <w:color w:val="6E6E73"/>
-          <w:sz w:val="17"/>
+          <w:rFonts w:ascii="Garamond" w:hAnsi="Garamond"/>
+          <w:i/>
+          <w:color w:val="554B46"/>
+          <w:sz w:val="16"/>
         </w:rPr>
-        <w:t>Der Muttekopf (2.774 m) ragt direkt über dem Talboden auf.</w:t>
+        <w:t>Der Muttekopf (2.774 m) überragt majestätisch das Standlager zu Imst.</w:t>
       </w:r>
     </w:p>
     <w:p>
       <w:pPr>
         <w:keepNext/>
-        <w:spacing w:before="480" w:after="80"/>
+        <w:spacing w:before="240" w:after="80"/>
       </w:pPr>
       <w:r>
         <w:rPr>
-          <w:rFonts w:ascii="Helvetica Neue" w:hAnsi="Helvetica Neue"/>
+          <w:rFonts w:ascii="Baskerville" w:hAnsi="Baskerville"/>
           <w:b/>
-          <w:color w:val="0F6E56"/>
-          <w:sz w:val="17"/>
+          <w:color w:val="801C24"/>
+          <w:sz w:val="23"/>
         </w:rPr>
-        <w:t>STATION 03 · WANDERWEGE &amp; KULTUR</w:t>
+        <w:t xml:space="preserve">III.  </w:t>
+      </w:r>
+      <w:r>
+        <w:rPr>
+          <w:rFonts w:ascii="Baskerville" w:hAnsi="Baskerville"/>
+          <w:b/>
+          <w:color w:val="1E1E1E"/>
+          <w:sz w:val="23"/>
+        </w:rPr>
+        <w:t>Durch kühle Schluchten zur sonnigen Alm</w:t>
+      </w:r>
+    </w:p>
+    <w:p>
+      <w:pPr>
+        <w:spacing w:line="276" w:lineRule="auto" w:after="80"/>
+        <w:ind w:firstLine="288"/>
+        <w:jc w:val="both"/>
+      </w:pPr>
+      <w:r>
+        <w:rPr>
+          <w:rFonts w:ascii="Garamond" w:hAnsi="Garamond"/>
+          <w:color w:val="1E1E1E"/>
+          <w:sz w:val="19"/>
+        </w:rPr>
+        <w:t>In den folgenden Tagen durchstreiften die Neandertaler das Gebirge nach wohlüberlegtem Plane: vier bis fünf Stunden Gehzeit, fünfhundert bis siebenhundert Höhenmeter, stets auf gebahnten, schwindelfreien Pfaden zweiter Ordnung (T2).</w:t>
+      </w:r>
+    </w:p>
+    <w:p>
+      <w:pPr>
+        <w:spacing w:line="276" w:lineRule="auto" w:after="80"/>
+        <w:ind w:firstLine="288"/>
+        <w:jc w:val="both"/>
+      </w:pPr>
+      <w:r>
+        <w:rPr>
+          <w:rFonts w:ascii="Garamond" w:hAnsi="Garamond"/>
+          <w:color w:val="1E1E1E"/>
+          <w:sz w:val="19"/>
+        </w:rPr>
+        <w:t>Unmittelbar hinter dem Orte öffnet sich die wildromantische Rosengartenschlucht. Auf kühn gezimmerten Holzstegen schreitet man dem tosenden Schmelzwasser entgegen, vorbei an der Blauen Grotte, bis hinauf zur gastlichen Muttekopfhütte, woselbst frischer Kaiserschmarrn auf hölzernen Schüsseln gereicht wird.</w:t>
+      </w:r>
+    </w:p>
+    <w:p>
+      <w:r>
+        <w:br w:type="page"/>
+      </w:r>
+    </w:p>
+    <w:p>
+      <w:pPr>
+        <w:spacing w:before="0" w:after="80"/>
+        <w:jc w:val="center"/>
+      </w:pPr>
+      <w:r>
+        <w:rPr>
+          <w:rFonts w:ascii="Baskerville" w:hAnsi="Baskerville"/>
+          <w:color w:val="966E32"/>
+          <w:sz w:val="18"/>
+        </w:rPr>
+        <w:t>— ❖ —</w:t>
       </w:r>
     </w:p>
     <w:p>
       <w:pPr>
         <w:keepNext/>
-        <w:spacing w:before="80" w:after="240"/>
-      </w:pPr>
-      <w:r>
-        <w:rPr>
-          <w:rFonts w:ascii="Helvetica Neue" w:hAnsi="Helvetica Neue"/>
-          <w:b/>
-          <w:color w:val="1D1D1F"/>
-          <w:sz w:val="56"/>
-        </w:rPr>
-        <w:t>Schluchten, Zirbenduft</w:t>
-      </w:r>
-      <w:r>
-        <w:rPr>
-          <w:rFonts w:ascii="Helvetica Neue" w:hAnsi="Helvetica Neue"/>
-          <w:b w:val="0"/>
-          <w:color w:val="6E6E73"/>
-          <w:sz w:val="56"/>
-        </w:rPr>
-        <w:t xml:space="preserve"> &amp; alte Meister.</w:t>
-      </w:r>
-    </w:p>
-    <w:p>
-      <w:pPr>
-        <w:spacing w:after="180" w:line="324" w:lineRule="auto"/>
-      </w:pPr>
-      <w:r>
-        <w:rPr>
-          <w:rFonts w:ascii="Helvetica Neue" w:hAnsi="Helvetica Neue"/>
-          <w:color w:val="1D1D1F"/>
-          <w:sz w:val="21"/>
-        </w:rPr>
-        <w:t>In den folgenden zehn Tagen taten die beiden genau das, was Neandertaler am besten können: genüsslich durch ihr Revier streifen. Keine alpinen Gewaltmärsche, sondern das bewährte Wohlfühlfenster von vier bis fünf Stunden und 500 bis 700 Höhenmetern auf besten, trittsicheren Wegen:</w:t>
-      </w:r>
-    </w:p>
-    <w:p>
-      <w:pPr>
-        <w:spacing w:after="120" w:line="312" w:lineRule="auto"/>
-        <w:ind w:left="360"/>
-      </w:pPr>
-      <w:r>
-        <w:rPr>
-          <w:rFonts w:ascii="Helvetica Neue" w:hAnsi="Helvetica Neue"/>
-          <w:b/>
-          <w:color w:val="0F6E56"/>
-          <w:sz w:val="20"/>
-        </w:rPr>
-        <w:t xml:space="preserve">—  </w:t>
-      </w:r>
-      <w:r>
-        <w:rPr>
-          <w:rFonts w:ascii="Helvetica Neue" w:hAnsi="Helvetica Neue"/>
-          <w:b/>
-          <w:color w:val="1D1D1F"/>
-          <w:sz w:val="21"/>
-        </w:rPr>
-        <w:t xml:space="preserve">Rosengartenschlucht: </w:t>
-      </w:r>
-      <w:r>
-        <w:rPr>
-          <w:rFonts w:ascii="Helvetica Neue" w:hAnsi="Helvetica Neue"/>
-          <w:color w:val="1D1D1F"/>
-          <w:sz w:val="21"/>
-        </w:rPr>
-        <w:t>Start direkt am Platz. Auf Holzstegen durch die schäumende Klamm hinauf zur Blauen Grotte und zur sonnigen Terrasse der Muttekopfhütte.</w:t>
-      </w:r>
-    </w:p>
-    <w:p>
-      <w:pPr>
-        <w:spacing w:after="120" w:line="312" w:lineRule="auto"/>
-        <w:ind w:left="360"/>
-      </w:pPr>
-      <w:r>
-        <w:rPr>
-          <w:rFonts w:ascii="Helvetica Neue" w:hAnsi="Helvetica Neue"/>
-          <w:b/>
-          <w:color w:val="0F6E56"/>
-          <w:sz w:val="20"/>
-        </w:rPr>
-        <w:t xml:space="preserve">—  </w:t>
-      </w:r>
-      <w:r>
-        <w:rPr>
-          <w:rFonts w:ascii="Helvetica Neue" w:hAnsi="Helvetica Neue"/>
-          <w:b/>
-          <w:color w:val="1D1D1F"/>
-          <w:sz w:val="21"/>
-        </w:rPr>
-        <w:t xml:space="preserve">Piburger See: </w:t>
-      </w:r>
-      <w:r>
-        <w:rPr>
-          <w:rFonts w:ascii="Helvetica Neue" w:hAnsi="Helvetica Neue"/>
-          <w:color w:val="1D1D1F"/>
-          <w:sz w:val="21"/>
-        </w:rPr>
-        <w:t>Ein tiefblauer, herrlich temperierter Waldsee im vorderen Ötztal. Schattiger Rundweg mit Badesteg und Forellenessen am Wasser.</w:t>
-      </w:r>
-    </w:p>
-    <w:p>
-      <w:pPr>
-        <w:spacing w:after="120" w:line="312" w:lineRule="auto"/>
-        <w:ind w:left="360"/>
-      </w:pPr>
-      <w:r>
-        <w:rPr>
-          <w:rFonts w:ascii="Helvetica Neue" w:hAnsi="Helvetica Neue"/>
-          <w:b/>
-          <w:color w:val="0F6E56"/>
-          <w:sz w:val="20"/>
-        </w:rPr>
-        <w:t xml:space="preserve">—  </w:t>
-      </w:r>
-      <w:r>
-        <w:rPr>
-          <w:rFonts w:ascii="Helvetica Neue" w:hAnsi="Helvetica Neue"/>
-          <w:b/>
-          <w:color w:val="1D1D1F"/>
-          <w:sz w:val="21"/>
-        </w:rPr>
-        <w:t xml:space="preserve">Zirbenweg am Hochzeiger: </w:t>
-      </w:r>
-      <w:r>
-        <w:rPr>
-          <w:rFonts w:ascii="Helvetica Neue" w:hAnsi="Helvetica Neue"/>
-          <w:color w:val="1D1D1F"/>
-          <w:sz w:val="21"/>
-        </w:rPr>
-        <w:t>Auf 2.000 Meter Höhe fast eben durch Jahrhunderte alte, intensiv duftende Zirbenbestände mit Blick auf die Gletscher.</w:t>
-      </w:r>
-    </w:p>
-    <w:p>
-      <w:pPr>
-        <w:keepNext/>
-        <w:spacing w:before="280" w:after="100"/>
+        <w:spacing w:before="160" w:after="60"/>
         <w:jc w:val="center"/>
       </w:pPr>
       <w:r>
         <w:drawing>
           <wp:inline xmlns:a="http://schemas.openxmlformats.org/drawingml/2006/main" xmlns:pic="http://schemas.openxmlformats.org/drawingml/2006/picture">
-            <wp:extent cx="5824728" cy="8737092"/>
+            <wp:extent cx="4023360" cy="6035040"/>
             <wp:docPr id="3" name="Picture 3"/>
             <wp:cNvGraphicFramePr>
               <a:graphicFrameLocks noChangeAspect="1"/>
@@ -513,7 +450,7 @@
                   <pic:spPr>
                     <a:xfrm>
                       <a:off x="0" y="0"/>
-                      <a:ext cx="5824728" cy="8737092"/>
+                      <a:ext cx="4023360" cy="6035040"/>
                     </a:xfrm>
                     <a:prstGeom prst="rect"/>
                   </pic:spPr>
@@ -526,49 +463,141 @@
     </w:p>
     <w:p>
       <w:pPr>
-        <w:spacing w:after="360" w:line="276" w:lineRule="auto"/>
+        <w:spacing w:after="200"/>
+        <w:jc w:val="center"/>
       </w:pPr>
       <w:r>
         <w:rPr>
-          <w:rFonts w:ascii="Helvetica Neue" w:hAnsi="Helvetica Neue"/>
+          <w:rFonts w:ascii="Baskerville" w:hAnsi="Baskerville"/>
           <w:b/>
-          <w:color w:val="1D1D1F"/>
-          <w:sz w:val="17"/>
+          <w:color w:val="801C24"/>
+          <w:sz w:val="16"/>
         </w:rPr>
-        <w:t xml:space="preserve">Rosengartenschlucht.  </w:t>
+        <w:t xml:space="preserve">Abb. 3: </w:t>
       </w:r>
       <w:r>
         <w:rPr>
-          <w:rFonts w:ascii="Helvetica Neue" w:hAnsi="Helvetica Neue"/>
-          <w:color w:val="6E6E73"/>
-          <w:sz w:val="17"/>
+          <w:rFonts w:ascii="Garamond" w:hAnsi="Garamond"/>
+          <w:i/>
+          <w:color w:val="554B46"/>
+          <w:sz w:val="16"/>
         </w:rPr>
-        <w:t>Naturdenkmal mit Stegen direkt ab Ortsrand Imst.</w:t>
+        <w:t>Felsstege und schäumende Kaskaden in der Rosengartenschlucht.</w:t>
       </w:r>
     </w:p>
     <w:p>
       <w:pPr>
-        <w:spacing w:after="180" w:line="324" w:lineRule="auto"/>
+        <w:spacing w:line="276" w:lineRule="auto" w:after="80"/>
+        <w:ind w:firstLine="0"/>
+        <w:jc w:val="both"/>
       </w:pPr>
       <w:r>
         <w:rPr>
-          <w:rFonts w:ascii="Helvetica Neue" w:hAnsi="Helvetica Neue"/>
-          <w:color w:val="1D1D1F"/>
-          <w:sz w:val="21"/>
+          <w:rFonts w:ascii="Garamond" w:hAnsi="Garamond"/>
+          <w:color w:val="1E1E1E"/>
+          <w:sz w:val="19"/>
         </w:rPr>
-        <w:t>Weil beide einen wachen Geist für Schönes und Geschichtsträchtiges hatten, flochten sie Entdeckungen in ihre Tage ein: Sie besuchten im Ötztal das Dorf von Ötzi – jenem jungen Schnösel aus der Kupferzeit, der mit seiner modernen Metall-Axt zwar berühmt wurde, aber gegen echte Neandertaler-Zähigkeit verblasste. Sie standen am 3.500 Jahre alten Brandopferplatz am Piller Sattel an der Römerstraße Via Claudia Augusta. Und an einem Nachmittag fuhren sie nach Innsbruck, um die futuristischen Glas-Stationen von Zaha Hadid zu bestaunen und in den Gassen Espresso zu trinken.</w:t>
+        <w:t>Ein weiterer Ausflugstag führte die Reisenden zum Piburger See am Eingang des Ötztales. Wie ein dunkelgrüner Edelstein ruht dieses warme Waldgewässer im Föhrenforste; nach zweistündiger Umwanderung pflegten die Wanderer die müden Glieder vom Bootssteg im klaren Flusse zu kühlen.</w:t>
+      </w:r>
+    </w:p>
+    <w:p>
+      <w:pPr>
+        <w:spacing w:line="276" w:lineRule="auto" w:after="80"/>
+        <w:ind w:firstLine="288"/>
+        <w:jc w:val="both"/>
+      </w:pPr>
+      <w:r>
+        <w:rPr>
+          <w:rFonts w:ascii="Garamond" w:hAnsi="Garamond"/>
+          <w:color w:val="1E1E1E"/>
+          <w:sz w:val="19"/>
+        </w:rPr>
+        <w:t>Am Hochzeiger wiederum geleitete die Bergbahn auf zweitausend Meter Höhe, woselbst ein fast ebener Spazierweg durch uralte, wohlriechende Zirbenhölzer führt.</w:t>
       </w:r>
     </w:p>
     <w:p>
       <w:pPr>
         <w:keepNext/>
-        <w:spacing w:before="280" w:after="100"/>
+        <w:spacing w:before="240" w:after="80"/>
+      </w:pPr>
+      <w:r>
+        <w:rPr>
+          <w:rFonts w:ascii="Baskerville" w:hAnsi="Baskerville"/>
+          <w:b/>
+          <w:color w:val="801C24"/>
+          <w:sz w:val="23"/>
+        </w:rPr>
+        <w:t xml:space="preserve">IV.  </w:t>
+      </w:r>
+      <w:r>
+        <w:rPr>
+          <w:rFonts w:ascii="Baskerville" w:hAnsi="Baskerville"/>
+          <w:b/>
+          <w:color w:val="1E1E1E"/>
+          <w:sz w:val="23"/>
+        </w:rPr>
+        <w:t>Kulturgeschichtliche Betrachtungen am Wege</w:t>
+      </w:r>
+    </w:p>
+    <w:p>
+      <w:pPr>
+        <w:spacing w:line="276" w:lineRule="auto" w:after="80"/>
+        <w:ind w:firstLine="288"/>
+        <w:jc w:val="both"/>
+      </w:pPr>
+      <w:r>
+        <w:rPr>
+          <w:rFonts w:ascii="Garamond" w:hAnsi="Garamond"/>
+          <w:color w:val="1E1E1E"/>
+          <w:sz w:val="19"/>
+        </w:rPr>
+        <w:t>Dem geschichtlichen Sinne der Neandertaler ward reiche Nahrung zuteil. Im Ötztal besichtigten sie die Heimstatt des Mannes im Eise – jenes Herrn Ötzi, der mit seinem neumodischen Kupferbeile zwar einigen Nachruhm erlangte, dessen Konstitution jedoch hinter der urwüchsigen Festigkeit eines echten Neandertalers merklich zurückblieb.</w:t>
+      </w:r>
+    </w:p>
+    <w:p>
+      <w:pPr>
+        <w:spacing w:line="276" w:lineRule="auto" w:after="80"/>
+        <w:ind w:firstLine="288"/>
+        <w:jc w:val="both"/>
+      </w:pPr>
+      <w:r>
+        <w:rPr>
+          <w:rFonts w:ascii="Garamond" w:hAnsi="Garamond"/>
+          <w:color w:val="1E1E1E"/>
+          <w:sz w:val="19"/>
+        </w:rPr>
+        <w:t>Am Piller Sattel erstiegen sie den dreitausendfünfhundertjährigen Brandopferplatz an der Römerstraße Via Claudia Augusta, und in der Landeshauptstadt Innsbruck galten die bewundernden Blicke den kühnen, futuristischen Seilbahnhöfen der Architektin Zaha Hadid.</w:t>
+      </w:r>
+    </w:p>
+    <w:p>
+      <w:r>
+        <w:br w:type="page"/>
+      </w:r>
+    </w:p>
+    <w:p>
+      <w:pPr>
+        <w:spacing w:before="0" w:after="80"/>
+        <w:jc w:val="center"/>
+      </w:pPr>
+      <w:r>
+        <w:rPr>
+          <w:rFonts w:ascii="Baskerville" w:hAnsi="Baskerville"/>
+          <w:color w:val="966E32"/>
+          <w:sz w:val="18"/>
+        </w:rPr>
+        <w:t>— ❖ —</w:t>
+      </w:r>
+    </w:p>
+    <w:p>
+      <w:pPr>
+        <w:keepNext/>
+        <w:spacing w:before="160" w:after="60"/>
         <w:jc w:val="center"/>
       </w:pPr>
       <w:r>
         <w:drawing>
           <wp:inline xmlns:a="http://schemas.openxmlformats.org/drawingml/2006/main" xmlns:pic="http://schemas.openxmlformats.org/drawingml/2006/picture">
-            <wp:extent cx="5824728" cy="4368546"/>
+            <wp:extent cx="4023360" cy="3017520"/>
             <wp:docPr id="4" name="Picture 4"/>
             <wp:cNvGraphicFramePr>
               <a:graphicFrameLocks noChangeAspect="1"/>
@@ -589,7 +618,7 @@
                   <pic:spPr>
                     <a:xfrm>
                       <a:off x="0" y="0"/>
-                      <a:ext cx="5824728" cy="4368546"/>
+                      <a:ext cx="4023360" cy="3017520"/>
                     </a:xfrm>
                     <a:prstGeom prst="rect"/>
                   </pic:spPr>
@@ -602,255 +631,165 @@
     </w:p>
     <w:p>
       <w:pPr>
-        <w:spacing w:after="360" w:line="276" w:lineRule="auto"/>
+        <w:spacing w:after="200"/>
+        <w:jc w:val="center"/>
       </w:pPr>
       <w:r>
         <w:rPr>
-          <w:rFonts w:ascii="Helvetica Neue" w:hAnsi="Helvetica Neue"/>
+          <w:rFonts w:ascii="Baskerville" w:hAnsi="Baskerville"/>
           <w:b/>
-          <w:color w:val="1D1D1F"/>
-          <w:sz w:val="17"/>
+          <w:color w:val="801C24"/>
+          <w:sz w:val="16"/>
         </w:rPr>
-        <w:t xml:space="preserve">Piburger See.  </w:t>
+        <w:t xml:space="preserve">Abb. 4: </w:t>
       </w:r>
       <w:r>
         <w:rPr>
-          <w:rFonts w:ascii="Helvetica Neue" w:hAnsi="Helvetica Neue"/>
-          <w:color w:val="6E6E73"/>
-          <w:sz w:val="17"/>
+          <w:rFonts w:ascii="Garamond" w:hAnsi="Garamond"/>
+          <w:i/>
+          <w:color w:val="554B46"/>
+          <w:sz w:val="16"/>
         </w:rPr>
-        <w:t>Kristallklares Waldwasser vor der Kulisse des Acherkogels.</w:t>
+        <w:t>Der stille Piburger See, umrahmt von schattigem Nadelwalde.</w:t>
       </w:r>
     </w:p>
     <w:p>
       <w:pPr>
         <w:keepNext/>
-        <w:spacing w:before="480" w:after="80"/>
+        <w:spacing w:before="240" w:after="80"/>
       </w:pPr>
       <w:r>
         <w:rPr>
-          <w:rFonts w:ascii="Helvetica Neue" w:hAnsi="Helvetica Neue"/>
+          <w:rFonts w:ascii="Baskerville" w:hAnsi="Baskerville"/>
           <w:b/>
-          <w:color w:val="0F6E56"/>
-          <w:sz w:val="17"/>
+          <w:color w:val="801C24"/>
+          <w:sz w:val="23"/>
         </w:rPr>
-        <w:t>STATION 04 · DER SAMSTAGMORGEN</w:t>
+        <w:t xml:space="preserve">V.  </w:t>
+      </w:r>
+      <w:r>
+        <w:rPr>
+          <w:rFonts w:ascii="Baskerville" w:hAnsi="Baskerville"/>
+          <w:b/>
+          <w:color w:val="1E1E1E"/>
+          <w:sz w:val="23"/>
+        </w:rPr>
+        <w:t>Von der morgendlichen Zerstreuung im Forste</w:t>
+      </w:r>
+    </w:p>
+    <w:p>
+      <w:pPr>
+        <w:spacing w:line="276" w:lineRule="auto" w:after="80"/>
+        <w:ind w:firstLine="0"/>
+        <w:jc w:val="both"/>
+      </w:pPr>
+      <w:r>
+        <w:rPr>
+          <w:rFonts w:ascii="Garamond" w:hAnsi="Garamond"/>
+          <w:color w:val="1E1E1E"/>
+          <w:sz w:val="19"/>
+        </w:rPr>
+        <w:t>Am ersten Sonnabend ward ein altes Gesetz des häuslichen Friedens geübt: Die geschätzte Reisegefährtin pflegte die vornehmste Tugend der Erholung, schlief geruhsam aus, bereitete den schwarzen Mokka und vertiefte sich vor dem Kraftwagen in der Morgensonne in ein erbauliches Buch.</w:t>
+      </w:r>
+    </w:p>
+    <w:p>
+      <w:pPr>
+        <w:spacing w:line="276" w:lineRule="auto" w:after="80"/>
+        <w:ind w:firstLine="288"/>
+        <w:jc w:val="both"/>
+      </w:pPr>
+      <w:r>
+        <w:rPr>
+          <w:rFonts w:ascii="Garamond" w:hAnsi="Garamond"/>
+          <w:color w:val="1E1E1E"/>
+          <w:sz w:val="19"/>
+        </w:rPr>
+        <w:t>Der Neandertaler hingegen, getrieben von flüchtiger Bewegungsfreude, schloss sich für eine knappe Stunde und vierzig Minuten einer kleinen Schar Einheimischer an, welche für die geringe Gebühr von 35 Schillingen (Euro) sechzehn Kilometer durch die Fichtenforste trabten. Pünktlich zur Mittagsstunde stand er frisch gebadet wieder am Lager; der restliche Nachmittag gehörte ungeteilt der gemeinsamen Muße.</w:t>
       </w:r>
     </w:p>
     <w:p>
       <w:pPr>
         <w:keepNext/>
-        <w:spacing w:before="80" w:after="240"/>
+        <w:spacing w:before="240" w:after="80"/>
       </w:pPr>
       <w:r>
         <w:rPr>
-          <w:rFonts w:ascii="Helvetica Neue" w:hAnsi="Helvetica Neue"/>
+          <w:rFonts w:ascii="Baskerville" w:hAnsi="Baskerville"/>
           <w:b/>
-          <w:color w:val="1D1D1F"/>
-          <w:sz w:val="56"/>
+          <w:color w:val="801C24"/>
+          <w:sz w:val="23"/>
         </w:rPr>
-        <w:t>Die feine Kunst</w:t>
+        <w:t xml:space="preserve">VI.  </w:t>
       </w:r>
       <w:r>
         <w:rPr>
-          <w:rFonts w:ascii="Helvetica Neue" w:hAnsi="Helvetica Neue"/>
-          <w:b w:val="0"/>
-          <w:color w:val="6E6E73"/>
-          <w:sz w:val="56"/>
+          <w:rFonts w:ascii="Baskerville" w:hAnsi="Baskerville"/>
+          <w:b/>
+          <w:color w:val="1E1E1E"/>
+          <w:sz w:val="23"/>
         </w:rPr>
-        <w:t xml:space="preserve"> der Ruhe.</w:t>
+        <w:t>Der Fundbericht zu Holzmaden</w:t>
       </w:r>
     </w:p>
     <w:p>
       <w:pPr>
-        <w:spacing w:after="180" w:line="324" w:lineRule="auto"/>
+        <w:spacing w:line="276" w:lineRule="auto" w:after="80"/>
+        <w:ind w:firstLine="288"/>
+        <w:jc w:val="both"/>
       </w:pPr>
       <w:r>
         <w:rPr>
-          <w:rFonts w:ascii="Helvetica Neue" w:hAnsi="Helvetica Neue"/>
-          <w:color w:val="1D1D1F"/>
-          <w:sz w:val="21"/>
+          <w:rFonts w:ascii="Garamond" w:hAnsi="Garamond"/>
+          <w:color w:val="1E1E1E"/>
+          <w:sz w:val="19"/>
         </w:rPr>
-        <w:t>Am ersten Samstagmorgen trat eine uralte, friedliche Arbeitsteilung in Kraft:</w:t>
+        <w:t>Die Heimfahrt nach zwei Wochen ward durch eine wissenschaftliche Rast von hohem Range gekrönt: Am Fuße der Schwäbischen Alb besuchten sie das Urwelt-Museum Hauff zu Holzmaden. Hier traten ihnen hundertachtzig Millionen Jahre alte versteinerte Meeresungeheuer – Ichthyosaurier von makelloser Erhaltung – und die weltberühmte, riesige Seelilienwand vor Augen. Nach herzhafter Stärkung mit schwäbischen Maultaschen rollte der Wagen wohlbehalten der heimatlichen Düssel zu.</w:t>
+      </w:r>
+    </w:p>
+    <w:p>
+      <w:r>
+        <w:br w:type="page"/>
       </w:r>
     </w:p>
     <w:p>
       <w:pPr>
-        <w:spacing w:after="180" w:line="324" w:lineRule="auto"/>
+        <w:spacing w:before="0" w:after="80"/>
+        <w:jc w:val="center"/>
       </w:pPr>
       <w:r>
         <w:rPr>
-          <w:rFonts w:ascii="Helvetica Neue" w:hAnsi="Helvetica Neue"/>
-          <w:color w:val="1D1D1F"/>
-          <w:sz w:val="21"/>
+          <w:rFonts w:ascii="Baskerville" w:hAnsi="Baskerville"/>
+          <w:color w:val="966E32"/>
+          <w:sz w:val="18"/>
         </w:rPr>
-        <w:t>Sie entschied sich für die absolute Königsdisziplin der Ferien: genüsslich ausschlafen, den ersten Espresso aufbrühen, den Liegestuhl in die Morgensonne vor den Camper stellen und mit einem guten Buch die Seele baumeln lassen.</w:t>
+        <w:t>— ❖ —</w:t>
       </w:r>
     </w:p>
     <w:p>
       <w:pPr>
-        <w:spacing w:after="180" w:line="324" w:lineRule="auto"/>
+        <w:spacing w:before="160" w:after="40"/>
+        <w:jc w:val="center"/>
       </w:pPr>
       <w:r>
         <w:rPr>
-          <w:rFonts w:ascii="Helvetica Neue" w:hAnsi="Helvetica Neue"/>
-          <w:color w:val="1D1D1F"/>
-          <w:sz w:val="21"/>
+          <w:rFonts w:ascii="Baskerville" w:hAnsi="Baskerville"/>
+          <w:b/>
+          <w:color w:val="801C24"/>
+          <w:sz w:val="19"/>
         </w:rPr>
-        <w:t>Er hingegen verspürte das typische leichte Kribbeln in den Beinen. Völlig unaufgeregt trabte er um die Ecke in den Fichtenwald: Dort veranstaltete der lokale Turn- und Sportverein einen kleinen, ehrlichen Waldlauf über 16 Kilometer. Für schmale 35 Tauschmünzen lief er knapp anderthalb Stunden über weiche Wald- und Almwege, schwitzte sich einmal gründlich durch – und stand um 11:30 Uhr frisch geduscht, duftend und mit frischen Früchten wieder am Camper.</w:t>
-      </w:r>
-    </w:p>
-    <w:tbl>
-      <w:tblPr>
-        <w:tblW w:type="auto" w:w="0"/>
-        <w:jc w:val="center"/>
-        <w:tblLayout w:type="fixed"/>
-        <w:tblLook w:firstColumn="1" w:firstRow="1" w:lastColumn="0" w:lastRow="0" w:noHBand="0" w:noVBand="1" w:val="04A0"/>
-      </w:tblPr>
-      <w:tblGrid>
-        <w:gridCol w:w="9173"/>
-      </w:tblGrid>
-      <w:tr>
-        <w:tc>
-          <w:tcPr>
-            <w:tcW w:type="dxa" w:w="9173"/>
-            <w:shd w:fill="F5F5F7"/>
-            <w:tcMar>
-              <w:top w:w="200" w:type="dxa"/>
-              <w:bottom w:w="200" w:type="dxa"/>
-              <w:left w:w="260" w:type="dxa"/>
-              <w:right w:w="260" w:type="dxa"/>
-            </w:tcMar>
-            <w:tcBorders>
-              <w:left w:val="single" w:sz="24" w:space="0" w:color="0F6E56"/>
-              <w:top w:val="none"/>
-              <w:right w:val="none"/>
-              <w:bottom w:val="none"/>
-            </w:tcBorders>
-          </w:tcPr>
-          <w:p>
-            <w:pPr>
-              <w:spacing w:after="40" w:line="312" w:lineRule="auto"/>
-            </w:pPr>
-            <w:r>
-              <w:rPr>
-                <w:rFonts w:ascii="Helvetica Neue" w:hAnsi="Helvetica Neue"/>
-                <w:b/>
-                <w:color w:val="1D1D1F"/>
-                <w:sz w:val="22"/>
-              </w:rPr>
-              <w:t>„Um Punkt zwölf Uhr saßen beide gemeinsam beim Mittagessen in der Sonne. Der Vormittag war perfekt – und vor ihnen lag noch eine volle Woche reiner, gemeinsamer Bergurlaub.“</w:t>
-            </w:r>
-          </w:p>
-          <w:p>
-            <w:pPr>
-              <w:spacing w:before="80" w:after="0"/>
-            </w:pPr>
-            <w:r>
-              <w:rPr>
-                <w:rFonts w:ascii="Helvetica Neue" w:hAnsi="Helvetica Neue"/>
-                <w:color w:val="6E6E73"/>
-                <w:sz w:val="18"/>
-              </w:rPr>
-              <w:t>Notiz zum Samstag: Maximale Erholung für beide, null Organisationsstress.</w:t>
-            </w:r>
-          </w:p>
-        </w:tc>
-      </w:tr>
-    </w:tbl>
-    <w:p>
-      <w:pPr>
-        <w:spacing w:before="160" w:after="0"/>
-      </w:pPr>
-    </w:p>
-    <w:p>
-      <w:pPr>
-        <w:keepNext/>
-        <w:spacing w:before="480" w:after="80"/>
-      </w:pPr>
-      <w:r>
-        <w:rPr>
-          <w:rFonts w:ascii="Helvetica Neue" w:hAnsi="Helvetica Neue"/>
-          <w:b/>
-          <w:color w:val="0F6E56"/>
-          <w:sz w:val="17"/>
-        </w:rPr>
-        <w:t>STATION 05 · SCHWÄBISCHE ALB</w:t>
+        <w:t>PRAKTISCHER WEGWEISER FÜR DEN KRAFTFAHRER</w:t>
       </w:r>
     </w:p>
     <w:p>
       <w:pPr>
         <w:keepNext/>
-        <w:spacing w:before="80" w:after="240"/>
-      </w:pPr>
-      <w:r>
-        <w:rPr>
-          <w:rFonts w:ascii="Helvetica Neue" w:hAnsi="Helvetica Neue"/>
-          <w:b/>
-          <w:color w:val="1D1D1F"/>
-          <w:sz w:val="56"/>
-        </w:rPr>
-        <w:t>180 Millionen Jahre</w:t>
-      </w:r>
-      <w:r>
-        <w:rPr>
-          <w:rFonts w:ascii="Helvetica Neue" w:hAnsi="Helvetica Neue"/>
-          <w:b w:val="0"/>
-          <w:color w:val="6E6E73"/>
-          <w:sz w:val="56"/>
-        </w:rPr>
-        <w:t xml:space="preserve"> zum Dessert.</w:t>
-      </w:r>
-    </w:p>
-    <w:p>
-      <w:pPr>
-        <w:spacing w:after="180" w:line="324" w:lineRule="auto"/>
-      </w:pPr>
-      <w:r>
-        <w:rPr>
-          <w:rFonts w:ascii="Helvetica Neue" w:hAnsi="Helvetica Neue"/>
-          <w:color w:val="1D1D1F"/>
-          <w:sz w:val="21"/>
-        </w:rPr>
-        <w:t>Nach zwei Wochen rollte die Höhle auf Rädern wieder nordwärts. Doch statt zäher Autobahnmeilen wartete nach gut zwei Stunden Fahrt an der Schwäbischen Alb das spektakuläre Finale:</w:t>
-      </w:r>
-    </w:p>
-    <w:p>
-      <w:pPr>
-        <w:spacing w:after="180" w:line="324" w:lineRule="auto"/>
-      </w:pPr>
-      <w:r>
-        <w:rPr>
-          <w:rFonts w:ascii="Helvetica Neue" w:hAnsi="Helvetica Neue"/>
-          <w:color w:val="1D1D1F"/>
-          <w:sz w:val="21"/>
-        </w:rPr>
-        <w:t>In Holzmaden hielten sie am Urwelt-Museum Hauff. Dort standen die beiden Neandertaler staunend vor den weltberühmten, meterlangen Fischsauriern mit erhaltenen Hautumrissen und vor der gigantischen, hundert Quadratmeter großen versteinerten Seelilienwand – Erdgeschichte, die an den Wänden wie zeitgenössische Skulpturen wirkte.</w:t>
-      </w:r>
-    </w:p>
-    <w:p>
-      <w:pPr>
-        <w:spacing w:after="180" w:line="324" w:lineRule="auto"/>
-      </w:pPr>
-      <w:r>
-        <w:rPr>
-          <w:rFonts w:ascii="Helvetica Neue" w:hAnsi="Helvetica Neue"/>
-          <w:color w:val="1D1D1F"/>
-          <w:sz w:val="21"/>
-        </w:rPr>
-        <w:t>Nach einem Teller hausgemachter schwäbischer Maultaschen traten sie die letzten Kilometer an. Sie erreichten das heimatliche Tal am späten Nachmittag – erholt, geerdet, mit Bergluft in der Lunge und dem gemeinsamen Entschluss: Das war die beste Reise seit der Eiszeit.</w:t>
-      </w:r>
-    </w:p>
-    <w:p>
-      <w:pPr>
-        <w:keepNext/>
-        <w:spacing w:before="280" w:after="100"/>
+        <w:spacing w:before="160" w:after="60"/>
         <w:jc w:val="center"/>
       </w:pPr>
       <w:r>
         <w:drawing>
           <wp:inline xmlns:a="http://schemas.openxmlformats.org/drawingml/2006/main" xmlns:pic="http://schemas.openxmlformats.org/drawingml/2006/picture">
-            <wp:extent cx="5824728" cy="8748027"/>
+            <wp:extent cx="4023360" cy="6042593"/>
             <wp:docPr id="5" name="Picture 5"/>
             <wp:cNvGraphicFramePr>
               <a:graphicFrameLocks noChangeAspect="1"/>
@@ -871,7 +810,7 @@
                   <pic:spPr>
                     <a:xfrm>
                       <a:off x="0" y="0"/>
-                      <a:ext cx="5824728" cy="8748027"/>
+                      <a:ext cx="4023360" cy="6042593"/>
                     </a:xfrm>
                     <a:prstGeom prst="rect"/>
                   </pic:spPr>
@@ -884,39 +823,26 @@
     </w:p>
     <w:p>
       <w:pPr>
-        <w:spacing w:after="360" w:line="276" w:lineRule="auto"/>
+        <w:spacing w:after="200"/>
+        <w:jc w:val="center"/>
       </w:pPr>
       <w:r>
         <w:rPr>
-          <w:rFonts w:ascii="Helvetica Neue" w:hAnsi="Helvetica Neue"/>
+          <w:rFonts w:ascii="Baskerville" w:hAnsi="Baskerville"/>
           <w:b/>
-          <w:color w:val="1D1D1F"/>
-          <w:sz w:val="17"/>
+          <w:color w:val="801C24"/>
+          <w:sz w:val="16"/>
         </w:rPr>
-        <w:t xml:space="preserve">Urwelt-Museum Hauff.  </w:t>
+        <w:t xml:space="preserve">Abb. 5: </w:t>
       </w:r>
       <w:r>
         <w:rPr>
-          <w:rFonts w:ascii="Helvetica Neue" w:hAnsi="Helvetica Neue"/>
-          <w:color w:val="6E6E73"/>
-          <w:sz w:val="17"/>
+          <w:rFonts w:ascii="Garamond" w:hAnsi="Garamond"/>
+          <w:i/>
+          <w:color w:val="554B46"/>
+          <w:sz w:val="16"/>
         </w:rPr>
-        <w:t>Versteinerte Seelilienkolonie aus dem Posidonienschiefer.</w:t>
-      </w:r>
-    </w:p>
-    <w:p>
-      <w:pPr>
-        <w:keepNext/>
-        <w:spacing w:before="560" w:after="160"/>
-      </w:pPr>
-      <w:r>
-        <w:rPr>
-          <w:rFonts w:ascii="Helvetica Neue" w:hAnsi="Helvetica Neue"/>
-          <w:b/>
-          <w:color w:val="0F6E56"/>
-          <w:sz w:val="18"/>
-        </w:rPr>
-        <w:t>REISE-SPEZIFIKATION · IM DETAIL</w:t>
+        <w:t>Die berühmte versteinerte Seelilienwand im Hauff'schen Museum zu Holzmaden.</w:t>
       </w:r>
     </w:p>
     <w:tbl>
@@ -925,60 +851,54 @@
         <w:jc w:val="center"/>
         <w:tblLayout w:type="fixed"/>
         <w:tblLook w:firstColumn="1" w:firstRow="1" w:lastColumn="0" w:lastRow="0" w:noHBand="0" w:noVBand="1" w:val="04A0"/>
+        <w:tblBorders>
+          <w:top w:val="single" w:sz="12" w:space="0" w:color="801C24"/>
+          <w:bottom w:val="single" w:sz="12" w:space="0" w:color="801C24"/>
+          <w:insideH w:val="single" w:sz="4" w:space="0" w:color="CCCCCC"/>
+          <w:left w:val="none"/>
+          <w:right w:val="none"/>
+          <w:insideV w:val="none"/>
+        </w:tblBorders>
       </w:tblPr>
       <w:tblGrid>
-        <w:gridCol w:w="4586"/>
-        <w:gridCol w:w="4586"/>
+        <w:gridCol w:w="3261"/>
+        <w:gridCol w:w="3261"/>
       </w:tblGrid>
       <w:tr>
         <w:tc>
           <w:tcPr>
-            <w:tcW w:type="dxa" w:w="2592"/>
-            <w:shd w:fill="F5F5F7"/>
-            <w:tcMar>
-              <w:top w:w="130" w:type="dxa"/>
-              <w:bottom w:w="130" w:type="dxa"/>
-              <w:left w:w="180" w:type="dxa"/>
-              <w:right w:w="180" w:type="dxa"/>
-            </w:tcMar>
+            <w:tcW w:type="dxa" w:w="1872"/>
           </w:tcPr>
           <w:p>
             <w:pPr>
-              <w:spacing w:after="0"/>
+              <w:spacing w:before="60" w:after="60"/>
             </w:pPr>
             <w:r>
               <w:rPr>
-                <w:rFonts w:ascii="Helvetica Neue" w:hAnsi="Helvetica Neue"/>
+                <w:rFonts w:ascii="Baskerville" w:hAnsi="Baskerville"/>
                 <w:b/>
-                <w:color w:val="1D1D1F"/>
-                <w:sz w:val="18"/>
+                <w:color w:val="801C24"/>
+                <w:sz w:val="17"/>
               </w:rPr>
-              <w:t>Zeitfenster</w:t>
+              <w:t>Reisezeit:</w:t>
             </w:r>
           </w:p>
         </w:tc>
         <w:tc>
           <w:tcPr>
-            <w:tcW w:type="dxa" w:w="6581"/>
-            <w:shd w:fill="F5F5F7"/>
-            <w:tcMar>
-              <w:top w:w="130" w:type="dxa"/>
-              <w:bottom w:w="130" w:type="dxa"/>
-              <w:left w:w="180" w:type="dxa"/>
-              <w:right w:w="180" w:type="dxa"/>
-            </w:tcMar>
+            <w:tcW w:type="dxa" w:w="4608"/>
           </w:tcPr>
           <w:p>
             <w:pPr>
-              <w:spacing w:after="0" w:line="288" w:lineRule="auto"/>
+              <w:spacing w:before="60" w:after="60" w:line="276" w:lineRule="auto"/>
             </w:pPr>
             <w:r>
               <w:rPr>
-                <w:rFonts w:ascii="Helvetica Neue" w:hAnsi="Helvetica Neue"/>
-                <w:color w:val="1D1D1F"/>
-                <w:sz w:val="18"/>
+                <w:rFonts w:ascii="Garamond" w:hAnsi="Garamond"/>
+                <w:color w:val="1E1E1E"/>
+                <w:sz w:val="17"/>
               </w:rPr>
-              <w:t>Mitte Juni (Frühsommerliche Frische, Tagestemperaturen 18–22 °C, vor den Schulferien)</w:t>
+              <w:t>Mitte Juni (Frühsommerliche Kühle, 18–22 °C, vor den Schulferien).</w:t>
             </w:r>
           </w:p>
         </w:tc>
@@ -986,52 +906,38 @@
       <w:tr>
         <w:tc>
           <w:tcPr>
-            <w:tcW w:type="dxa" w:w="2592"/>
-            <w:shd w:fill="FFFFFF"/>
-            <w:tcMar>
-              <w:top w:w="130" w:type="dxa"/>
-              <w:bottom w:w="130" w:type="dxa"/>
-              <w:left w:w="180" w:type="dxa"/>
-              <w:right w:w="180" w:type="dxa"/>
-            </w:tcMar>
+            <w:tcW w:type="dxa" w:w="1872"/>
           </w:tcPr>
           <w:p>
             <w:pPr>
-              <w:spacing w:after="0"/>
+              <w:spacing w:before="60" w:after="60"/>
             </w:pPr>
             <w:r>
               <w:rPr>
-                <w:rFonts w:ascii="Helvetica Neue" w:hAnsi="Helvetica Neue"/>
+                <w:rFonts w:ascii="Baskerville" w:hAnsi="Baskerville"/>
                 <w:b/>
-                <w:color w:val="1D1D1F"/>
-                <w:sz w:val="18"/>
+                <w:color w:val="801C24"/>
+                <w:sz w:val="17"/>
               </w:rPr>
-              <w:t>Reiseroute</w:t>
+              <w:t>Marschroute:</w:t>
             </w:r>
           </w:p>
         </w:tc>
         <w:tc>
           <w:tcPr>
-            <w:tcW w:type="dxa" w:w="6581"/>
-            <w:shd w:fill="FFFFFF"/>
-            <w:tcMar>
-              <w:top w:w="130" w:type="dxa"/>
-              <w:bottom w:w="130" w:type="dxa"/>
-              <w:left w:w="180" w:type="dxa"/>
-              <w:right w:w="180" w:type="dxa"/>
-            </w:tcMar>
+            <w:tcW w:type="dxa" w:w="4608"/>
           </w:tcPr>
           <w:p>
             <w:pPr>
-              <w:spacing w:after="0" w:line="288" w:lineRule="auto"/>
+              <w:spacing w:before="60" w:after="60" w:line="276" w:lineRule="auto"/>
             </w:pPr>
             <w:r>
               <w:rPr>
-                <w:rFonts w:ascii="Helvetica Neue" w:hAnsi="Helvetica Neue"/>
-                <w:color w:val="1D1D1F"/>
-                <w:sz w:val="18"/>
+                <w:rFonts w:ascii="Garamond" w:hAnsi="Garamond"/>
+                <w:color w:val="1E1E1E"/>
+                <w:sz w:val="17"/>
               </w:rPr>
-              <w:t>Düsseldorf ➔ Lindau (Bodensee) ➔ Imst (Tirol) ➔ Holzmaden ➔ Düsseldorf</w:t>
+              <w:t>Düsseldorf ➔ Lindau (5,5 Std.) ➔ Imst (1,5 Std.) ➔ Holzmaden ➔ Heimkehr.</w:t>
             </w:r>
           </w:p>
         </w:tc>
@@ -1039,52 +945,38 @@
       <w:tr>
         <w:tc>
           <w:tcPr>
-            <w:tcW w:type="dxa" w:w="2592"/>
-            <w:shd w:fill="F5F5F7"/>
-            <w:tcMar>
-              <w:top w:w="130" w:type="dxa"/>
-              <w:bottom w:w="130" w:type="dxa"/>
-              <w:left w:w="180" w:type="dxa"/>
-              <w:right w:w="180" w:type="dxa"/>
-            </w:tcMar>
+            <w:tcW w:type="dxa" w:w="1872"/>
           </w:tcPr>
           <w:p>
             <w:pPr>
-              <w:spacing w:after="0"/>
+              <w:spacing w:before="60" w:after="60"/>
             </w:pPr>
             <w:r>
               <w:rPr>
-                <w:rFonts w:ascii="Helvetica Neue" w:hAnsi="Helvetica Neue"/>
+                <w:rFonts w:ascii="Baskerville" w:hAnsi="Baskerville"/>
                 <w:b/>
-                <w:color w:val="1D1D1F"/>
-                <w:sz w:val="18"/>
+                <w:color w:val="801C24"/>
+                <w:sz w:val="17"/>
               </w:rPr>
-              <w:t>Etappenzeit</w:t>
+              <w:t>Standlager:</w:t>
             </w:r>
           </w:p>
         </w:tc>
         <w:tc>
           <w:tcPr>
-            <w:tcW w:type="dxa" w:w="6581"/>
-            <w:shd w:fill="F5F5F7"/>
-            <w:tcMar>
-              <w:top w:w="130" w:type="dxa"/>
-              <w:bottom w:w="130" w:type="dxa"/>
-              <w:left w:w="180" w:type="dxa"/>
-              <w:right w:w="180" w:type="dxa"/>
-            </w:tcMar>
+            <w:tcW w:type="dxa" w:w="4608"/>
           </w:tcPr>
           <w:p>
             <w:pPr>
-              <w:spacing w:after="0" w:line="288" w:lineRule="auto"/>
+              <w:spacing w:before="60" w:after="60" w:line="276" w:lineRule="auto"/>
             </w:pPr>
             <w:r>
               <w:rPr>
-                <w:rFonts w:ascii="Helvetica Neue" w:hAnsi="Helvetica Neue"/>
-                <w:color w:val="1D1D1F"/>
-                <w:sz w:val="18"/>
+                <w:rFonts w:ascii="Garamond" w:hAnsi="Garamond"/>
+                <w:color w:val="1E1E1E"/>
+                <w:sz w:val="17"/>
               </w:rPr>
-              <w:t>Hinfahrt: 5,5 h nach Lindau, danach nur 1,5 h nach Imst. Rückfahrt: 2,2 h nach Holzmaden, 4,0 h nach DUS.</w:t>
+              <w:t>Campingpark FiNK zu Imst (vorzügliche Bäder, absolute Stille, Bäckernähe).</w:t>
             </w:r>
           </w:p>
         </w:tc>
@@ -1092,52 +984,38 @@
       <w:tr>
         <w:tc>
           <w:tcPr>
-            <w:tcW w:type="dxa" w:w="2592"/>
-            <w:shd w:fill="FFFFFF"/>
-            <w:tcMar>
-              <w:top w:w="130" w:type="dxa"/>
-              <w:bottom w:w="130" w:type="dxa"/>
-              <w:left w:w="180" w:type="dxa"/>
-              <w:right w:w="180" w:type="dxa"/>
-            </w:tcMar>
+            <w:tcW w:type="dxa" w:w="1872"/>
           </w:tcPr>
           <w:p>
             <w:pPr>
-              <w:spacing w:after="0"/>
+              <w:spacing w:before="60" w:after="60"/>
             </w:pPr>
             <w:r>
               <w:rPr>
-                <w:rFonts w:ascii="Helvetica Neue" w:hAnsi="Helvetica Neue"/>
+                <w:rFonts w:ascii="Baskerville" w:hAnsi="Baskerville"/>
                 <w:b/>
-                <w:color w:val="1D1D1F"/>
-                <w:sz w:val="18"/>
+                <w:color w:val="801C24"/>
+                <w:sz w:val="17"/>
               </w:rPr>
-              <w:t>Basislager</w:t>
+              <w:t>Wanderungen:</w:t>
             </w:r>
           </w:p>
         </w:tc>
         <w:tc>
           <w:tcPr>
-            <w:tcW w:type="dxa" w:w="6581"/>
-            <w:shd w:fill="FFFFFF"/>
-            <w:tcMar>
-              <w:top w:w="130" w:type="dxa"/>
-              <w:bottom w:w="130" w:type="dxa"/>
-              <w:left w:w="180" w:type="dxa"/>
-              <w:right w:w="180" w:type="dxa"/>
-            </w:tcMar>
+            <w:tcW w:type="dxa" w:w="4608"/>
           </w:tcPr>
           <w:p>
             <w:pPr>
-              <w:spacing w:after="0" w:line="288" w:lineRule="auto"/>
+              <w:spacing w:before="60" w:after="60" w:line="276" w:lineRule="auto"/>
             </w:pPr>
             <w:r>
               <w:rPr>
-                <w:rFonts w:ascii="Helvetica Neue" w:hAnsi="Helvetica Neue"/>
-                <w:color w:val="1D1D1F"/>
-                <w:sz w:val="18"/>
+                <w:rFonts w:ascii="Garamond" w:hAnsi="Garamond"/>
+                <w:color w:val="1E1E1E"/>
+                <w:sz w:val="17"/>
               </w:rPr>
-              <w:t>Campingpark FiNK in Imst (klein, ruhig, top-moderne Sanitäranlagen, Bergblick, fußläufiger Bäcker)</w:t>
+              <w:t>Täglich 4–5 Std., 500–700 m Höhenunterschied auf guten Pfaden (T2).</w:t>
             </w:r>
           </w:p>
         </w:tc>
@@ -1145,52 +1023,38 @@
       <w:tr>
         <w:tc>
           <w:tcPr>
-            <w:tcW w:type="dxa" w:w="2592"/>
-            <w:shd w:fill="F5F5F7"/>
-            <w:tcMar>
-              <w:top w:w="130" w:type="dxa"/>
-              <w:bottom w:w="130" w:type="dxa"/>
-              <w:left w:w="180" w:type="dxa"/>
-              <w:right w:w="180" w:type="dxa"/>
-            </w:tcMar>
+            <w:tcW w:type="dxa" w:w="1872"/>
           </w:tcPr>
           <w:p>
             <w:pPr>
-              <w:spacing w:after="0"/>
+              <w:spacing w:before="60" w:after="60"/>
             </w:pPr>
             <w:r>
               <w:rPr>
-                <w:rFonts w:ascii="Helvetica Neue" w:hAnsi="Helvetica Neue"/>
+                <w:rFonts w:ascii="Baskerville" w:hAnsi="Baskerville"/>
                 <w:b/>
-                <w:color w:val="1D1D1F"/>
-                <w:sz w:val="18"/>
+                <w:color w:val="801C24"/>
+                <w:sz w:val="17"/>
               </w:rPr>
-              <w:t>Wander-Profil</w:t>
+              <w:t>Kulturdenkmale:</w:t>
             </w:r>
           </w:p>
         </w:tc>
         <w:tc>
           <w:tcPr>
-            <w:tcW w:type="dxa" w:w="6581"/>
-            <w:shd w:fill="F5F5F7"/>
-            <w:tcMar>
-              <w:top w:w="130" w:type="dxa"/>
-              <w:bottom w:w="130" w:type="dxa"/>
-              <w:left w:w="180" w:type="dxa"/>
-              <w:right w:w="180" w:type="dxa"/>
-            </w:tcMar>
+            <w:tcW w:type="dxa" w:w="4608"/>
           </w:tcPr>
           <w:p>
             <w:pPr>
-              <w:spacing w:after="0" w:line="288" w:lineRule="auto"/>
+              <w:spacing w:before="60" w:after="60" w:line="276" w:lineRule="auto"/>
             </w:pPr>
             <w:r>
               <w:rPr>
-                <w:rFonts w:ascii="Helvetica Neue" w:hAnsi="Helvetica Neue"/>
-                <w:color w:val="1D1D1F"/>
-                <w:sz w:val="18"/>
+                <w:rFonts w:ascii="Garamond" w:hAnsi="Garamond"/>
+                <w:color w:val="1E1E1E"/>
+                <w:sz w:val="17"/>
               </w:rPr>
-              <w:t>4 bis 5 Stunden / 500 bis 700 Höhenmeter (T2, schattige Schluchten, warme Waldseen, Almen)</w:t>
+              <w:t>Brandopferplatz am Piller Sattel, Ötzi-Dorf, Zaha-Hadid-Bauten Innsbruck.</w:t>
             </w:r>
           </w:p>
         </w:tc>
@@ -1198,113 +1062,60 @@
       <w:tr>
         <w:tc>
           <w:tcPr>
-            <w:tcW w:type="dxa" w:w="2592"/>
-            <w:shd w:fill="FFFFFF"/>
-            <w:tcMar>
-              <w:top w:w="130" w:type="dxa"/>
-              <w:bottom w:w="130" w:type="dxa"/>
-              <w:left w:w="180" w:type="dxa"/>
-              <w:right w:w="180" w:type="dxa"/>
-            </w:tcMar>
+            <w:tcW w:type="dxa" w:w="1872"/>
           </w:tcPr>
           <w:p>
             <w:pPr>
-              <w:spacing w:after="0"/>
+              <w:spacing w:before="60" w:after="60"/>
             </w:pPr>
             <w:r>
               <w:rPr>
-                <w:rFonts w:ascii="Helvetica Neue" w:hAnsi="Helvetica Neue"/>
+                <w:rFonts w:ascii="Baskerville" w:hAnsi="Baskerville"/>
                 <w:b/>
-                <w:color w:val="1D1D1F"/>
-                <w:sz w:val="18"/>
+                <w:color w:val="801C24"/>
+                <w:sz w:val="17"/>
               </w:rPr>
-              <w:t>Kultur-Trilogie</w:t>
+              <w:t>Samstagsübung:</w:t>
             </w:r>
           </w:p>
         </w:tc>
         <w:tc>
           <w:tcPr>
-            <w:tcW w:type="dxa" w:w="6581"/>
-            <w:shd w:fill="FFFFFF"/>
-            <w:tcMar>
-              <w:top w:w="130" w:type="dxa"/>
-              <w:bottom w:w="130" w:type="dxa"/>
-              <w:left w:w="180" w:type="dxa"/>
-              <w:right w:w="180" w:type="dxa"/>
-            </w:tcMar>
+            <w:tcW w:type="dxa" w:w="4608"/>
           </w:tcPr>
           <w:p>
             <w:pPr>
-              <w:spacing w:after="0" w:line="288" w:lineRule="auto"/>
+              <w:spacing w:before="60" w:after="60" w:line="276" w:lineRule="auto"/>
             </w:pPr>
             <w:r>
               <w:rPr>
-                <w:rFonts w:ascii="Helvetica Neue" w:hAnsi="Helvetica Neue"/>
-                <w:color w:val="1D1D1F"/>
-                <w:sz w:val="18"/>
+                <w:rFonts w:ascii="Garamond" w:hAnsi="Garamond"/>
+                <w:color w:val="1E1E1E"/>
+                <w:sz w:val="17"/>
               </w:rPr>
-              <w:t>Urweltmuseum Hauff (Paläontologie), Piller Sattel &amp; Ötzi (Archäologie), Zaha Hadid (Baukunst)</w:t>
-            </w:r>
-          </w:p>
-        </w:tc>
-      </w:tr>
-      <w:tr>
-        <w:tc>
-          <w:tcPr>
-            <w:tcW w:type="dxa" w:w="2592"/>
-            <w:shd w:fill="F5F5F7"/>
-            <w:tcMar>
-              <w:top w:w="130" w:type="dxa"/>
-              <w:bottom w:w="130" w:type="dxa"/>
-              <w:left w:w="180" w:type="dxa"/>
-              <w:right w:w="180" w:type="dxa"/>
-            </w:tcMar>
-          </w:tcPr>
-          <w:p>
-            <w:pPr>
-              <w:spacing w:after="0"/>
-            </w:pPr>
-            <w:r>
-              <w:rPr>
-                <w:rFonts w:ascii="Helvetica Neue" w:hAnsi="Helvetica Neue"/>
-                <w:b/>
-                <w:color w:val="1D1D1F"/>
-                <w:sz w:val="18"/>
-              </w:rPr>
-              <w:t>Das Samstag-Extra</w:t>
-            </w:r>
-          </w:p>
-        </w:tc>
-        <w:tc>
-          <w:tcPr>
-            <w:tcW w:type="dxa" w:w="6581"/>
-            <w:shd w:fill="F5F5F7"/>
-            <w:tcMar>
-              <w:top w:w="130" w:type="dxa"/>
-              <w:bottom w:w="130" w:type="dxa"/>
-              <w:left w:w="180" w:type="dxa"/>
-              <w:right w:w="180" w:type="dxa"/>
-            </w:tcMar>
-          </w:tcPr>
-          <w:p>
-            <w:pPr>
-              <w:spacing w:after="0" w:line="288" w:lineRule="auto"/>
-            </w:pPr>
-            <w:r>
-              <w:rPr>
-                <w:rFonts w:ascii="Helvetica Neue" w:hAnsi="Helvetica Neue"/>
-                <w:color w:val="1D1D1F"/>
-                <w:sz w:val="18"/>
-              </w:rPr>
-              <w:t>TS16 Adventure (16,9 km / 800 Hm für 35 € Startgeld; um 11:30 Uhr geduscht beendet)</w:t>
+              <w:t>Tschirgant TS16 (16,9 km / 800 m Hm; 35 Euro Startgebühr; Mittags beendet).</w:t>
             </w:r>
           </w:p>
         </w:tc>
       </w:tr>
     </w:tbl>
+    <w:p>
+      <w:pPr>
+        <w:spacing w:before="280" w:after="0"/>
+        <w:jc w:val="center"/>
+      </w:pPr>
+      <w:r>
+        <w:rPr>
+          <w:rFonts w:ascii="Baskerville" w:hAnsi="Baskerville"/>
+          <w:color w:val="966E32"/>
+          <w:sz w:val="18"/>
+        </w:rPr>
+        <w:t>— FINIS —</w:t>
+      </w:r>
+    </w:p>
     <w:sectPr>
-      <w:pgSz w:w="11909" w:h="16834"/>
-      <w:pgMar w:top="1368" w:right="1368" w:bottom="1368" w:left="1368" w:header="720" w:footer="720" w:gutter="0"/>
+      <w:pgSz w:w="8395" w:h="11909"/>
+      <w:pgMar w:top="936" w:right="936" w:bottom="936" w:left="936" w:header="720" w:footer="720" w:gutter="0"/>
       <w:cols w:space="720"/>
       <w:docGrid w:linePitch="360"/>
     </w:sectPr>

</xml_diff>